<commit_message>
Implementa desafio Evento-Customer com testes
</commit_message>
<xml_diff>
--- a/Analise/EVENTO-CUSTOMER.docx
+++ b/Analise/EVENTO-CUSTOMER.docx
@@ -37,7 +37,7 @@
           <w:sz w:val="22"/>
           <w:szCs w:val="22"/>
         </w:rPr>
-        <w:t xml:space="preserve">Projeto: fc-ddd-patterns-evento-customer | Data de geracao: 07/08/2026, 17:15:55</w:t>
+        <w:t xml:space="preserve">Projeto: fc-ddd-patterns-evento-customer | Data de geracao: 07/08/2026, 17:45:43</w:t>
       </w:r>
     </w:p>
     <w:p>
@@ -2026,7 +2026,7 @@
         <w:spacing w:after="120" w:before="260"/>
       </w:pPr>
       <w:r>
-        <w:t xml:space="preserve">5. Publicacao e Assinatura</w:t>
+        <w:t xml:space="preserve">5. Como Executar Manualmente e Ver o Console</w:t>
       </w:r>
     </w:p>
     <w:p>
@@ -2039,7 +2039,16 @@
           <w:sz w:val="22"/>
           <w:szCs w:val="22"/>
         </w:rPr>
-        <w:t xml:space="preserve">A publicacao e assinatura usam a classe EventDispatcher ja existente. Os handlers sao registrados pelo nome da classe do evento e executados quando notify recebe a instancia correspondente.</w:t>
+        <w:t xml:space="preserve">Para criar um novo Customer e verificar as duas impressoes no console, registre os dois handlers de CustomerCreatedEvent no EventDispatcher, crie o Customer, instancie o evento com id e name e chame notify.</w:t>
+      </w:r>
+    </w:p>
+    <w:p>
+      <w:pPr>
+        <w:pStyle w:val="Heading2"/>
+        <w:spacing w:after="120" w:before="260"/>
+      </w:pPr>
+      <w:r>
+        <w:t xml:space="preserve">5.1 Criacao de Customer</w:t>
       </w:r>
     </w:p>
     <w:p>
@@ -2060,27 +2069,47 @@
           <w:sz w:val="17"/>
           <w:szCs w:val="17"/>
         </w:rPr>
-        <w:t xml:space="preserve">import EventDispatcherInterface from "./event-dispatcher.interface";</w:t>
-      </w:r>
-      <w:r>
-        <w:rPr>
-          <w:rFonts w:ascii="Consolas" w:cs="Consolas" w:eastAsia="Consolas" w:hAnsi="Consolas"/>
-          <w:color w:val="1F2937"/>
-          <w:sz w:val="17"/>
-          <w:szCs w:val="17"/>
-        </w:rPr>
-        <w:br/>
-        <w:t xml:space="preserve">import EventHandlerInterface from "./event-handler.interface";</w:t>
-      </w:r>
-      <w:r>
-        <w:rPr>
-          <w:rFonts w:ascii="Consolas" w:cs="Consolas" w:eastAsia="Consolas" w:hAnsi="Consolas"/>
-          <w:color w:val="1F2937"/>
-          <w:sz w:val="17"/>
-          <w:szCs w:val="17"/>
-        </w:rPr>
-        <w:br/>
-        <w:t xml:space="preserve">import eventInterface from "./event.interface";</w:t>
+        <w:t xml:space="preserve">import EventDispatcher from "./src/domain/@shared/event/event-dispatcher";</w:t>
+      </w:r>
+      <w:r>
+        <w:rPr>
+          <w:rFonts w:ascii="Consolas" w:cs="Consolas" w:eastAsia="Consolas" w:hAnsi="Consolas"/>
+          <w:color w:val="1F2937"/>
+          <w:sz w:val="17"/>
+          <w:szCs w:val="17"/>
+        </w:rPr>
+        <w:br/>
+        <w:t xml:space="preserve">import Customer from "./src/domain/customer/entity/customer";</w:t>
+      </w:r>
+      <w:r>
+        <w:rPr>
+          <w:rFonts w:ascii="Consolas" w:cs="Consolas" w:eastAsia="Consolas" w:hAnsi="Consolas"/>
+          <w:color w:val="1F2937"/>
+          <w:sz w:val="17"/>
+          <w:szCs w:val="17"/>
+        </w:rPr>
+        <w:br/>
+        <w:t xml:space="preserve">import CustomerCreatedEvent from "./src/domain/customer/event/customer-created.event";</w:t>
+      </w:r>
+      <w:r>
+        <w:rPr>
+          <w:rFonts w:ascii="Consolas" w:cs="Consolas" w:eastAsia="Consolas" w:hAnsi="Consolas"/>
+          <w:color w:val="1F2937"/>
+          <w:sz w:val="17"/>
+          <w:szCs w:val="17"/>
+        </w:rPr>
+        <w:br/>
+        <w:t xml:space="preserve">import EnviaConsoleLog1Handler from "./src/domain/customer/event/handler/envia-console-log-1.handler";</w:t>
+      </w:r>
+      <w:r>
+        <w:rPr>
+          <w:rFonts w:ascii="Consolas" w:cs="Consolas" w:eastAsia="Consolas" w:hAnsi="Consolas"/>
+          <w:color w:val="1F2937"/>
+          <w:sz w:val="17"/>
+          <w:szCs w:val="17"/>
+        </w:rPr>
+        <w:br/>
+        <w:t xml:space="preserve">import EnviaConsoleLog2Handler from "./src/domain/customer/event/handler/envia-console-log-2.handler";</w:t>
       </w:r>
       <w:r>
         <w:rPr>
@@ -2100,17 +2129,27 @@
           <w:szCs w:val="17"/>
         </w:rPr>
         <w:br/>
-        <w:t xml:space="preserve">export default class EventDispatcher implements EventDispatcherInterface {</w:t>
-      </w:r>
-      <w:r>
-        <w:rPr>
-          <w:rFonts w:ascii="Consolas" w:cs="Consolas" w:eastAsia="Consolas" w:hAnsi="Consolas"/>
-          <w:color w:val="1F2937"/>
-          <w:sz w:val="17"/>
-          <w:szCs w:val="17"/>
-        </w:rPr>
-        <w:br/>
-        <w:t xml:space="preserve">  private eventHandlers: { [eventName: string]: EventHandlerInterface[] } = {};</w:t>
+        <w:t xml:space="preserve">const eventDispatcher = new EventDispatcher();</w:t>
+      </w:r>
+      <w:r>
+        <w:rPr>
+          <w:rFonts w:ascii="Consolas" w:cs="Consolas" w:eastAsia="Consolas" w:hAnsi="Consolas"/>
+          <w:color w:val="1F2937"/>
+          <w:sz w:val="17"/>
+          <w:szCs w:val="17"/>
+        </w:rPr>
+        <w:br/>
+        <w:t xml:space="preserve">eventDispatcher.register("CustomerCreatedEvent", new EnviaConsoleLog1Handler());</w:t>
+      </w:r>
+      <w:r>
+        <w:rPr>
+          <w:rFonts w:ascii="Consolas" w:cs="Consolas" w:eastAsia="Consolas" w:hAnsi="Consolas"/>
+          <w:color w:val="1F2937"/>
+          <w:sz w:val="17"/>
+          <w:szCs w:val="17"/>
+        </w:rPr>
+        <w:br/>
+        <w:t xml:space="preserve">eventDispatcher.register("CustomerCreatedEvent", new EnviaConsoleLog2Handler());</w:t>
       </w:r>
       <w:r>
         <w:rPr>
@@ -2130,27 +2169,47 @@
           <w:szCs w:val="17"/>
         </w:rPr>
         <w:br/>
-        <w:t xml:space="preserve">  get getEventHandlers(): { [eventName: string]: EventHandlerInterface[] } {</w:t>
-      </w:r>
-      <w:r>
-        <w:rPr>
-          <w:rFonts w:ascii="Consolas" w:cs="Consolas" w:eastAsia="Consolas" w:hAnsi="Consolas"/>
-          <w:color w:val="1F2937"/>
-          <w:sz w:val="17"/>
-          <w:szCs w:val="17"/>
-        </w:rPr>
-        <w:br/>
-        <w:t xml:space="preserve">    return this.eventHandlers;</w:t>
-      </w:r>
-      <w:r>
-        <w:rPr>
-          <w:rFonts w:ascii="Consolas" w:cs="Consolas" w:eastAsia="Consolas" w:hAnsi="Consolas"/>
-          <w:color w:val="1F2937"/>
-          <w:sz w:val="17"/>
-          <w:szCs w:val="17"/>
-        </w:rPr>
-        <w:br/>
-        <w:t xml:space="preserve">  }</w:t>
+        <w:t xml:space="preserve">const customer = new Customer("123", "Customer 1");</w:t>
+      </w:r>
+      <w:r>
+        <w:rPr>
+          <w:rFonts w:ascii="Consolas" w:cs="Consolas" w:eastAsia="Consolas" w:hAnsi="Consolas"/>
+          <w:color w:val="1F2937"/>
+          <w:sz w:val="17"/>
+          <w:szCs w:val="17"/>
+        </w:rPr>
+        <w:br/>
+        <w:t xml:space="preserve">const customerCreatedEvent = new CustomerCreatedEvent({</w:t>
+      </w:r>
+      <w:r>
+        <w:rPr>
+          <w:rFonts w:ascii="Consolas" w:cs="Consolas" w:eastAsia="Consolas" w:hAnsi="Consolas"/>
+          <w:color w:val="1F2937"/>
+          <w:sz w:val="17"/>
+          <w:szCs w:val="17"/>
+        </w:rPr>
+        <w:br/>
+        <w:t xml:space="preserve">  id: customer.id,</w:t>
+      </w:r>
+      <w:r>
+        <w:rPr>
+          <w:rFonts w:ascii="Consolas" w:cs="Consolas" w:eastAsia="Consolas" w:hAnsi="Consolas"/>
+          <w:color w:val="1F2937"/>
+          <w:sz w:val="17"/>
+          <w:szCs w:val="17"/>
+        </w:rPr>
+        <w:br/>
+        <w:t xml:space="preserve">  name: customer.name,</w:t>
+      </w:r>
+      <w:r>
+        <w:rPr>
+          <w:rFonts w:ascii="Consolas" w:cs="Consolas" w:eastAsia="Consolas" w:hAnsi="Consolas"/>
+          <w:color w:val="1F2937"/>
+          <w:sz w:val="17"/>
+          <w:szCs w:val="17"/>
+        </w:rPr>
+        <w:br/>
+        <w:t xml:space="preserve">});</w:t>
       </w:r>
       <w:r>
         <w:rPr>
@@ -2170,296 +2229,7 @@
           <w:szCs w:val="17"/>
         </w:rPr>
         <w:br/>
-        <w:t xml:space="preserve">  register(eventName: string, eventHandler: EventHandlerInterface): void {</w:t>
-      </w:r>
-      <w:r>
-        <w:rPr>
-          <w:rFonts w:ascii="Consolas" w:cs="Consolas" w:eastAsia="Consolas" w:hAnsi="Consolas"/>
-          <w:color w:val="1F2937"/>
-          <w:sz w:val="17"/>
-          <w:szCs w:val="17"/>
-        </w:rPr>
-        <w:br/>
-        <w:t xml:space="preserve">    if (!this.eventHandlers[eventName]) {</w:t>
-      </w:r>
-      <w:r>
-        <w:rPr>
-          <w:rFonts w:ascii="Consolas" w:cs="Consolas" w:eastAsia="Consolas" w:hAnsi="Consolas"/>
-          <w:color w:val="1F2937"/>
-          <w:sz w:val="17"/>
-          <w:szCs w:val="17"/>
-        </w:rPr>
-        <w:br/>
-        <w:t xml:space="preserve">      this.eventHandlers[eventName] = [];</w:t>
-      </w:r>
-      <w:r>
-        <w:rPr>
-          <w:rFonts w:ascii="Consolas" w:cs="Consolas" w:eastAsia="Consolas" w:hAnsi="Consolas"/>
-          <w:color w:val="1F2937"/>
-          <w:sz w:val="17"/>
-          <w:szCs w:val="17"/>
-        </w:rPr>
-        <w:br/>
-        <w:t xml:space="preserve">    }</w:t>
-      </w:r>
-      <w:r>
-        <w:rPr>
-          <w:rFonts w:ascii="Consolas" w:cs="Consolas" w:eastAsia="Consolas" w:hAnsi="Consolas"/>
-          <w:color w:val="1F2937"/>
-          <w:sz w:val="17"/>
-          <w:szCs w:val="17"/>
-        </w:rPr>
-        <w:br/>
-        <w:t xml:space="preserve">    this.eventHandlers[eventName].push(eventHandler);</w:t>
-      </w:r>
-      <w:r>
-        <w:rPr>
-          <w:rFonts w:ascii="Consolas" w:cs="Consolas" w:eastAsia="Consolas" w:hAnsi="Consolas"/>
-          <w:color w:val="1F2937"/>
-          <w:sz w:val="17"/>
-          <w:szCs w:val="17"/>
-        </w:rPr>
-        <w:br/>
-        <w:t xml:space="preserve">  }</w:t>
-      </w:r>
-      <w:r>
-        <w:rPr>
-          <w:rFonts w:ascii="Consolas" w:cs="Consolas" w:eastAsia="Consolas" w:hAnsi="Consolas"/>
-          <w:color w:val="1F2937"/>
-          <w:sz w:val="17"/>
-          <w:szCs w:val="17"/>
-        </w:rPr>
-        <w:br/>
-        <w:t xml:space="preserve"> </w:t>
-      </w:r>
-      <w:r>
-        <w:rPr>
-          <w:rFonts w:ascii="Consolas" w:cs="Consolas" w:eastAsia="Consolas" w:hAnsi="Consolas"/>
-          <w:color w:val="1F2937"/>
-          <w:sz w:val="17"/>
-          <w:szCs w:val="17"/>
-        </w:rPr>
-        <w:br/>
-        <w:t xml:space="preserve">  unregister(eventName: string, eventHandler: EventHandlerInterface): void {</w:t>
-      </w:r>
-      <w:r>
-        <w:rPr>
-          <w:rFonts w:ascii="Consolas" w:cs="Consolas" w:eastAsia="Consolas" w:hAnsi="Consolas"/>
-          <w:color w:val="1F2937"/>
-          <w:sz w:val="17"/>
-          <w:szCs w:val="17"/>
-        </w:rPr>
-        <w:br/>
-        <w:t xml:space="preserve">    if (this.eventHandlers[eventName]) {</w:t>
-      </w:r>
-      <w:r>
-        <w:rPr>
-          <w:rFonts w:ascii="Consolas" w:cs="Consolas" w:eastAsia="Consolas" w:hAnsi="Consolas"/>
-          <w:color w:val="1F2937"/>
-          <w:sz w:val="17"/>
-          <w:szCs w:val="17"/>
-        </w:rPr>
-        <w:br/>
-        <w:t xml:space="preserve">      const index = this.eventHandlers[eventName].indexOf(eventHandler);</w:t>
-      </w:r>
-      <w:r>
-        <w:rPr>
-          <w:rFonts w:ascii="Consolas" w:cs="Consolas" w:eastAsia="Consolas" w:hAnsi="Consolas"/>
-          <w:color w:val="1F2937"/>
-          <w:sz w:val="17"/>
-          <w:szCs w:val="17"/>
-        </w:rPr>
-        <w:br/>
-        <w:t xml:space="preserve">      if (index !== -1) {</w:t>
-      </w:r>
-      <w:r>
-        <w:rPr>
-          <w:rFonts w:ascii="Consolas" w:cs="Consolas" w:eastAsia="Consolas" w:hAnsi="Consolas"/>
-          <w:color w:val="1F2937"/>
-          <w:sz w:val="17"/>
-          <w:szCs w:val="17"/>
-        </w:rPr>
-        <w:br/>
-        <w:t xml:space="preserve">        this.eventHandlers[eventName].splice(index, 1);</w:t>
-      </w:r>
-      <w:r>
-        <w:rPr>
-          <w:rFonts w:ascii="Consolas" w:cs="Consolas" w:eastAsia="Consolas" w:hAnsi="Consolas"/>
-          <w:color w:val="1F2937"/>
-          <w:sz w:val="17"/>
-          <w:szCs w:val="17"/>
-        </w:rPr>
-        <w:br/>
-        <w:t xml:space="preserve">      }</w:t>
-      </w:r>
-      <w:r>
-        <w:rPr>
-          <w:rFonts w:ascii="Consolas" w:cs="Consolas" w:eastAsia="Consolas" w:hAnsi="Consolas"/>
-          <w:color w:val="1F2937"/>
-          <w:sz w:val="17"/>
-          <w:szCs w:val="17"/>
-        </w:rPr>
-        <w:br/>
-        <w:t xml:space="preserve">    }</w:t>
-      </w:r>
-      <w:r>
-        <w:rPr>
-          <w:rFonts w:ascii="Consolas" w:cs="Consolas" w:eastAsia="Consolas" w:hAnsi="Consolas"/>
-          <w:color w:val="1F2937"/>
-          <w:sz w:val="17"/>
-          <w:szCs w:val="17"/>
-        </w:rPr>
-        <w:br/>
-        <w:t xml:space="preserve">  }</w:t>
-      </w:r>
-      <w:r>
-        <w:rPr>
-          <w:rFonts w:ascii="Consolas" w:cs="Consolas" w:eastAsia="Consolas" w:hAnsi="Consolas"/>
-          <w:color w:val="1F2937"/>
-          <w:sz w:val="17"/>
-          <w:szCs w:val="17"/>
-        </w:rPr>
-        <w:br/>
-        <w:t xml:space="preserve"> </w:t>
-      </w:r>
-      <w:r>
-        <w:rPr>
-          <w:rFonts w:ascii="Consolas" w:cs="Consolas" w:eastAsia="Consolas" w:hAnsi="Consolas"/>
-          <w:color w:val="1F2937"/>
-          <w:sz w:val="17"/>
-          <w:szCs w:val="17"/>
-        </w:rPr>
-        <w:br/>
-        <w:t xml:space="preserve">  unregisterAll(): void {</w:t>
-      </w:r>
-      <w:r>
-        <w:rPr>
-          <w:rFonts w:ascii="Consolas" w:cs="Consolas" w:eastAsia="Consolas" w:hAnsi="Consolas"/>
-          <w:color w:val="1F2937"/>
-          <w:sz w:val="17"/>
-          <w:szCs w:val="17"/>
-        </w:rPr>
-        <w:br/>
-        <w:t xml:space="preserve">    this.eventHandlers = {};</w:t>
-      </w:r>
-      <w:r>
-        <w:rPr>
-          <w:rFonts w:ascii="Consolas" w:cs="Consolas" w:eastAsia="Consolas" w:hAnsi="Consolas"/>
-          <w:color w:val="1F2937"/>
-          <w:sz w:val="17"/>
-          <w:szCs w:val="17"/>
-        </w:rPr>
-        <w:br/>
-        <w:t xml:space="preserve">  }</w:t>
-      </w:r>
-      <w:r>
-        <w:rPr>
-          <w:rFonts w:ascii="Consolas" w:cs="Consolas" w:eastAsia="Consolas" w:hAnsi="Consolas"/>
-          <w:color w:val="1F2937"/>
-          <w:sz w:val="17"/>
-          <w:szCs w:val="17"/>
-        </w:rPr>
-        <w:br/>
-        <w:t xml:space="preserve"> </w:t>
-      </w:r>
-      <w:r>
-        <w:rPr>
-          <w:rFonts w:ascii="Consolas" w:cs="Consolas" w:eastAsia="Consolas" w:hAnsi="Consolas"/>
-          <w:color w:val="1F2937"/>
-          <w:sz w:val="17"/>
-          <w:szCs w:val="17"/>
-        </w:rPr>
-        <w:br/>
-        <w:t xml:space="preserve">  notify(event: eventInterface): void {</w:t>
-      </w:r>
-      <w:r>
-        <w:rPr>
-          <w:rFonts w:ascii="Consolas" w:cs="Consolas" w:eastAsia="Consolas" w:hAnsi="Consolas"/>
-          <w:color w:val="1F2937"/>
-          <w:sz w:val="17"/>
-          <w:szCs w:val="17"/>
-        </w:rPr>
-        <w:br/>
-        <w:t xml:space="preserve">    const eventName = event.constructor.name;</w:t>
-      </w:r>
-      <w:r>
-        <w:rPr>
-          <w:rFonts w:ascii="Consolas" w:cs="Consolas" w:eastAsia="Consolas" w:hAnsi="Consolas"/>
-          <w:color w:val="1F2937"/>
-          <w:sz w:val="17"/>
-          <w:szCs w:val="17"/>
-        </w:rPr>
-        <w:br/>
-        <w:t xml:space="preserve">    if (this.eventHandlers[eventName]) {</w:t>
-      </w:r>
-      <w:r>
-        <w:rPr>
-          <w:rFonts w:ascii="Consolas" w:cs="Consolas" w:eastAsia="Consolas" w:hAnsi="Consolas"/>
-          <w:color w:val="1F2937"/>
-          <w:sz w:val="17"/>
-          <w:szCs w:val="17"/>
-        </w:rPr>
-        <w:br/>
-        <w:t xml:space="preserve">      this.eventHandlers[eventName].forEach((eventHandler) =&gt; {</w:t>
-      </w:r>
-      <w:r>
-        <w:rPr>
-          <w:rFonts w:ascii="Consolas" w:cs="Consolas" w:eastAsia="Consolas" w:hAnsi="Consolas"/>
-          <w:color w:val="1F2937"/>
-          <w:sz w:val="17"/>
-          <w:szCs w:val="17"/>
-        </w:rPr>
-        <w:br/>
-        <w:t xml:space="preserve">        eventHandler.handle(event);</w:t>
-      </w:r>
-      <w:r>
-        <w:rPr>
-          <w:rFonts w:ascii="Consolas" w:cs="Consolas" w:eastAsia="Consolas" w:hAnsi="Consolas"/>
-          <w:color w:val="1F2937"/>
-          <w:sz w:val="17"/>
-          <w:szCs w:val="17"/>
-        </w:rPr>
-        <w:br/>
-        <w:t xml:space="preserve">      });</w:t>
-      </w:r>
-      <w:r>
-        <w:rPr>
-          <w:rFonts w:ascii="Consolas" w:cs="Consolas" w:eastAsia="Consolas" w:hAnsi="Consolas"/>
-          <w:color w:val="1F2937"/>
-          <w:sz w:val="17"/>
-          <w:szCs w:val="17"/>
-        </w:rPr>
-        <w:br/>
-        <w:t xml:space="preserve">    }</w:t>
-      </w:r>
-      <w:r>
-        <w:rPr>
-          <w:rFonts w:ascii="Consolas" w:cs="Consolas" w:eastAsia="Consolas" w:hAnsi="Consolas"/>
-          <w:color w:val="1F2937"/>
-          <w:sz w:val="17"/>
-          <w:szCs w:val="17"/>
-        </w:rPr>
-        <w:br/>
-        <w:t xml:space="preserve">  }</w:t>
-      </w:r>
-      <w:r>
-        <w:rPr>
-          <w:rFonts w:ascii="Consolas" w:cs="Consolas" w:eastAsia="Consolas" w:hAnsi="Consolas"/>
-          <w:color w:val="1F2937"/>
-          <w:sz w:val="17"/>
-          <w:szCs w:val="17"/>
-        </w:rPr>
-        <w:br/>
-        <w:t xml:space="preserve">}</w:t>
-      </w:r>
-    </w:p>
-    <w:p>
-      <w:pPr>
-        <w:pStyle w:val="Heading1"/>
-        <w:spacing w:after="120" w:before="260"/>
-      </w:pPr>
-      <w:r>
-        <w:t xml:space="preserve">6. Testes Unitarios Implementados</w:t>
+        <w:t xml:space="preserve">eventDispatcher.notify(customerCreatedEvent);</w:t>
       </w:r>
     </w:p>
     <w:p>
@@ -2472,16 +2242,7 @@
           <w:sz w:val="22"/>
           <w:szCs w:val="22"/>
         </w:rPr>
-        <w:t xml:space="preserve">Os testes usam jest.spyOn nos metodos handle e em console.log. Isso garante tanto que os handlers foram chamados corretamente quanto que a saida de console exigida pelo desafio foi produzida.</w:t>
-      </w:r>
-    </w:p>
-    <w:p>
-      <w:pPr>
-        <w:pStyle w:val="Heading2"/>
-        <w:spacing w:after="120" w:before="260"/>
-      </w:pPr>
-      <w:r>
-        <w:t xml:space="preserve">6.1 CustomerCreatedEvent</w:t>
+        <w:t xml:space="preserve">Saida esperada no console:</w:t>
       </w:r>
     </w:p>
     <w:p>
@@ -2502,307 +2263,30 @@
           <w:sz w:val="17"/>
           <w:szCs w:val="17"/>
         </w:rPr>
-        <w:t xml:space="preserve">it("should notify two handlers when a customer is created", () =&gt; {</w:t>
-      </w:r>
-      <w:r>
-        <w:rPr>
-          <w:rFonts w:ascii="Consolas" w:cs="Consolas" w:eastAsia="Consolas" w:hAnsi="Consolas"/>
-          <w:color w:val="1F2937"/>
-          <w:sz w:val="17"/>
-          <w:szCs w:val="17"/>
-        </w:rPr>
-        <w:br/>
-        <w:t xml:space="preserve">    const eventDispatcher = new EventDispatcher();</w:t>
-      </w:r>
-      <w:r>
-        <w:rPr>
-          <w:rFonts w:ascii="Consolas" w:cs="Consolas" w:eastAsia="Consolas" w:hAnsi="Consolas"/>
-          <w:color w:val="1F2937"/>
-          <w:sz w:val="17"/>
-          <w:szCs w:val="17"/>
-        </w:rPr>
-        <w:br/>
-        <w:t xml:space="preserve">    const handler1 = new EnviaConsoleLog1Handler();</w:t>
-      </w:r>
-      <w:r>
-        <w:rPr>
-          <w:rFonts w:ascii="Consolas" w:cs="Consolas" w:eastAsia="Consolas" w:hAnsi="Consolas"/>
-          <w:color w:val="1F2937"/>
-          <w:sz w:val="17"/>
-          <w:szCs w:val="17"/>
-        </w:rPr>
-        <w:br/>
-        <w:t xml:space="preserve">    const handler2 = new EnviaConsoleLog2Handler();</w:t>
-      </w:r>
-      <w:r>
-        <w:rPr>
-          <w:rFonts w:ascii="Consolas" w:cs="Consolas" w:eastAsia="Consolas" w:hAnsi="Consolas"/>
-          <w:color w:val="1F2937"/>
-          <w:sz w:val="17"/>
-          <w:szCs w:val="17"/>
-        </w:rPr>
-        <w:br/>
-        <w:t xml:space="preserve">    const spyHandler1 = jest.spyOn(handler1, "handle");</w:t>
-      </w:r>
-      <w:r>
-        <w:rPr>
-          <w:rFonts w:ascii="Consolas" w:cs="Consolas" w:eastAsia="Consolas" w:hAnsi="Consolas"/>
-          <w:color w:val="1F2937"/>
-          <w:sz w:val="17"/>
-          <w:szCs w:val="17"/>
-        </w:rPr>
-        <w:br/>
-        <w:t xml:space="preserve">    const spyHandler2 = jest.spyOn(handler2, "handle");</w:t>
-      </w:r>
-      <w:r>
-        <w:rPr>
-          <w:rFonts w:ascii="Consolas" w:cs="Consolas" w:eastAsia="Consolas" w:hAnsi="Consolas"/>
-          <w:color w:val="1F2937"/>
-          <w:sz w:val="17"/>
-          <w:szCs w:val="17"/>
-        </w:rPr>
-        <w:br/>
-        <w:t xml:space="preserve">    const spyConsoleLog = jest</w:t>
-      </w:r>
-      <w:r>
-        <w:rPr>
-          <w:rFonts w:ascii="Consolas" w:cs="Consolas" w:eastAsia="Consolas" w:hAnsi="Consolas"/>
-          <w:color w:val="1F2937"/>
-          <w:sz w:val="17"/>
-          <w:szCs w:val="17"/>
-        </w:rPr>
-        <w:br/>
-        <w:t xml:space="preserve">      .spyOn(console, "log")</w:t>
-      </w:r>
-      <w:r>
-        <w:rPr>
-          <w:rFonts w:ascii="Consolas" w:cs="Consolas" w:eastAsia="Consolas" w:hAnsi="Consolas"/>
-          <w:color w:val="1F2937"/>
-          <w:sz w:val="17"/>
-          <w:szCs w:val="17"/>
-        </w:rPr>
-        <w:br/>
-        <w:t xml:space="preserve">      .mockImplementation(() =&gt; {});</w:t>
-      </w:r>
-      <w:r>
-        <w:rPr>
-          <w:rFonts w:ascii="Consolas" w:cs="Consolas" w:eastAsia="Consolas" w:hAnsi="Consolas"/>
-          <w:color w:val="1F2937"/>
-          <w:sz w:val="17"/>
-          <w:szCs w:val="17"/>
-        </w:rPr>
-        <w:br/>
-        <w:t xml:space="preserve"> </w:t>
-      </w:r>
-      <w:r>
-        <w:rPr>
-          <w:rFonts w:ascii="Consolas" w:cs="Consolas" w:eastAsia="Consolas" w:hAnsi="Consolas"/>
-          <w:color w:val="1F2937"/>
-          <w:sz w:val="17"/>
-          <w:szCs w:val="17"/>
-        </w:rPr>
-        <w:br/>
-        <w:t xml:space="preserve">    eventDispatcher.register("CustomerCreatedEvent", handler1);</w:t>
-      </w:r>
-      <w:r>
-        <w:rPr>
-          <w:rFonts w:ascii="Consolas" w:cs="Consolas" w:eastAsia="Consolas" w:hAnsi="Consolas"/>
-          <w:color w:val="1F2937"/>
-          <w:sz w:val="17"/>
-          <w:szCs w:val="17"/>
-        </w:rPr>
-        <w:br/>
-        <w:t xml:space="preserve">    eventDispatcher.register("CustomerCreatedEvent", handler2);</w:t>
-      </w:r>
-      <w:r>
-        <w:rPr>
-          <w:rFonts w:ascii="Consolas" w:cs="Consolas" w:eastAsia="Consolas" w:hAnsi="Consolas"/>
-          <w:color w:val="1F2937"/>
-          <w:sz w:val="17"/>
-          <w:szCs w:val="17"/>
-        </w:rPr>
-        <w:br/>
-        <w:t xml:space="preserve"> </w:t>
-      </w:r>
-      <w:r>
-        <w:rPr>
-          <w:rFonts w:ascii="Consolas" w:cs="Consolas" w:eastAsia="Consolas" w:hAnsi="Consolas"/>
-          <w:color w:val="1F2937"/>
-          <w:sz w:val="17"/>
-          <w:szCs w:val="17"/>
-        </w:rPr>
-        <w:br/>
-        <w:t xml:space="preserve">    const customer = new Customer("123", "Customer 1");</w:t>
-      </w:r>
-      <w:r>
-        <w:rPr>
-          <w:rFonts w:ascii="Consolas" w:cs="Consolas" w:eastAsia="Consolas" w:hAnsi="Consolas"/>
-          <w:color w:val="1F2937"/>
-          <w:sz w:val="17"/>
-          <w:szCs w:val="17"/>
-        </w:rPr>
-        <w:br/>
-        <w:t xml:space="preserve">    const customerCreatedEvent = new CustomerCreatedEvent({</w:t>
-      </w:r>
-      <w:r>
-        <w:rPr>
-          <w:rFonts w:ascii="Consolas" w:cs="Consolas" w:eastAsia="Consolas" w:hAnsi="Consolas"/>
-          <w:color w:val="1F2937"/>
-          <w:sz w:val="17"/>
-          <w:szCs w:val="17"/>
-        </w:rPr>
-        <w:br/>
-        <w:t xml:space="preserve">      id: customer.id,</w:t>
-      </w:r>
-      <w:r>
-        <w:rPr>
-          <w:rFonts w:ascii="Consolas" w:cs="Consolas" w:eastAsia="Consolas" w:hAnsi="Consolas"/>
-          <w:color w:val="1F2937"/>
-          <w:sz w:val="17"/>
-          <w:szCs w:val="17"/>
-        </w:rPr>
-        <w:br/>
-        <w:t xml:space="preserve">      name: customer.name,</w:t>
-      </w:r>
-      <w:r>
-        <w:rPr>
-          <w:rFonts w:ascii="Consolas" w:cs="Consolas" w:eastAsia="Consolas" w:hAnsi="Consolas"/>
-          <w:color w:val="1F2937"/>
-          <w:sz w:val="17"/>
-          <w:szCs w:val="17"/>
-        </w:rPr>
-        <w:br/>
-        <w:t xml:space="preserve">    });</w:t>
-      </w:r>
-      <w:r>
-        <w:rPr>
-          <w:rFonts w:ascii="Consolas" w:cs="Consolas" w:eastAsia="Consolas" w:hAnsi="Consolas"/>
-          <w:color w:val="1F2937"/>
-          <w:sz w:val="17"/>
-          <w:szCs w:val="17"/>
-        </w:rPr>
-        <w:br/>
-        <w:t xml:space="preserve"> </w:t>
-      </w:r>
-      <w:r>
-        <w:rPr>
-          <w:rFonts w:ascii="Consolas" w:cs="Consolas" w:eastAsia="Consolas" w:hAnsi="Consolas"/>
-          <w:color w:val="1F2937"/>
-          <w:sz w:val="17"/>
-          <w:szCs w:val="17"/>
-        </w:rPr>
-        <w:br/>
-        <w:t xml:space="preserve">    eventDispatcher.notify(customerCreatedEvent);</w:t>
-      </w:r>
-      <w:r>
-        <w:rPr>
-          <w:rFonts w:ascii="Consolas" w:cs="Consolas" w:eastAsia="Consolas" w:hAnsi="Consolas"/>
-          <w:color w:val="1F2937"/>
-          <w:sz w:val="17"/>
-          <w:szCs w:val="17"/>
-        </w:rPr>
-        <w:br/>
-        <w:t xml:space="preserve"> </w:t>
-      </w:r>
-      <w:r>
-        <w:rPr>
-          <w:rFonts w:ascii="Consolas" w:cs="Consolas" w:eastAsia="Consolas" w:hAnsi="Consolas"/>
-          <w:color w:val="1F2937"/>
-          <w:sz w:val="17"/>
-          <w:szCs w:val="17"/>
-        </w:rPr>
-        <w:br/>
-        <w:t xml:space="preserve">    expect(spyHandler1).toHaveBeenCalledWith(customerCreatedEvent);</w:t>
-      </w:r>
-      <w:r>
-        <w:rPr>
-          <w:rFonts w:ascii="Consolas" w:cs="Consolas" w:eastAsia="Consolas" w:hAnsi="Consolas"/>
-          <w:color w:val="1F2937"/>
-          <w:sz w:val="17"/>
-          <w:szCs w:val="17"/>
-        </w:rPr>
-        <w:br/>
-        <w:t xml:space="preserve">    expect(spyHandler2).toHaveBeenCalledWith(customerCreatedEvent);</w:t>
-      </w:r>
-      <w:r>
-        <w:rPr>
-          <w:rFonts w:ascii="Consolas" w:cs="Consolas" w:eastAsia="Consolas" w:hAnsi="Consolas"/>
-          <w:color w:val="1F2937"/>
-          <w:sz w:val="17"/>
-          <w:szCs w:val="17"/>
-        </w:rPr>
-        <w:br/>
-        <w:t xml:space="preserve">    expect(spyConsoleLog).toHaveBeenCalledWith(</w:t>
-      </w:r>
-      <w:r>
-        <w:rPr>
-          <w:rFonts w:ascii="Consolas" w:cs="Consolas" w:eastAsia="Consolas" w:hAnsi="Consolas"/>
-          <w:color w:val="1F2937"/>
-          <w:sz w:val="17"/>
-          <w:szCs w:val="17"/>
-        </w:rPr>
-        <w:br/>
-        <w:t xml:space="preserve">      "Esse é o primeiro console.log do evento: CustomerCreated"</w:t>
-      </w:r>
-      <w:r>
-        <w:rPr>
-          <w:rFonts w:ascii="Consolas" w:cs="Consolas" w:eastAsia="Consolas" w:hAnsi="Consolas"/>
-          <w:color w:val="1F2937"/>
-          <w:sz w:val="17"/>
-          <w:szCs w:val="17"/>
-        </w:rPr>
-        <w:br/>
-        <w:t xml:space="preserve">    );</w:t>
-      </w:r>
-      <w:r>
-        <w:rPr>
-          <w:rFonts w:ascii="Consolas" w:cs="Consolas" w:eastAsia="Consolas" w:hAnsi="Consolas"/>
-          <w:color w:val="1F2937"/>
-          <w:sz w:val="17"/>
-          <w:szCs w:val="17"/>
-        </w:rPr>
-        <w:br/>
-        <w:t xml:space="preserve">    expect(spyConsoleLog).toHaveBeenCalledWith(</w:t>
-      </w:r>
-      <w:r>
-        <w:rPr>
-          <w:rFonts w:ascii="Consolas" w:cs="Consolas" w:eastAsia="Consolas" w:hAnsi="Consolas"/>
-          <w:color w:val="1F2937"/>
-          <w:sz w:val="17"/>
-          <w:szCs w:val="17"/>
-        </w:rPr>
-        <w:br/>
-        <w:t xml:space="preserve">      "Esse é o segundo console.log do evento: CustomerCreated"</w:t>
-      </w:r>
-      <w:r>
-        <w:rPr>
-          <w:rFonts w:ascii="Consolas" w:cs="Consolas" w:eastAsia="Consolas" w:hAnsi="Consolas"/>
-          <w:color w:val="1F2937"/>
-          <w:sz w:val="17"/>
-          <w:szCs w:val="17"/>
-        </w:rPr>
-        <w:br/>
-        <w:t xml:space="preserve">    );</w:t>
-      </w:r>
-      <w:r>
-        <w:rPr>
-          <w:rFonts w:ascii="Consolas" w:cs="Consolas" w:eastAsia="Consolas" w:hAnsi="Consolas"/>
-          <w:color w:val="1F2937"/>
-          <w:sz w:val="17"/>
-          <w:szCs w:val="17"/>
-        </w:rPr>
-        <w:br/>
-        <w:t xml:space="preserve">    expect(spyConsoleLog).toHaveBeenCalledTimes(2);</w:t>
-      </w:r>
-      <w:r>
-        <w:rPr>
-          <w:rFonts w:ascii="Consolas" w:cs="Consolas" w:eastAsia="Consolas" w:hAnsi="Consolas"/>
-          <w:color w:val="1F2937"/>
-          <w:sz w:val="17"/>
-          <w:szCs w:val="17"/>
-        </w:rPr>
-        <w:br/>
-        <w:t xml:space="preserve">  });</w:t>
+        <w:t xml:space="preserve">Esse é o primeiro console.log do evento: CustomerCreated</w:t>
+      </w:r>
+      <w:r>
+        <w:rPr>
+          <w:rFonts w:ascii="Consolas" w:cs="Consolas" w:eastAsia="Consolas" w:hAnsi="Consolas"/>
+          <w:color w:val="1F2937"/>
+          <w:sz w:val="17"/>
+          <w:szCs w:val="17"/>
+        </w:rPr>
+        <w:br/>
+        <w:t xml:space="preserve">Esse é o segundo console.log do evento: CustomerCreated</w:t>
+      </w:r>
+    </w:p>
+    <w:p>
+      <w:pPr>
+        <w:spacing w:after="80" w:before="80"/>
+      </w:pPr>
+      <w:r>
+        <w:rPr>
+          <w:rFonts w:ascii="Calibri" w:cs="Calibri" w:eastAsia="Calibri" w:hAnsi="Calibri"/>
+          <w:sz w:val="22"/>
+          <w:szCs w:val="22"/>
+        </w:rPr>
+        <w:t xml:space="preserve">Para trocar o endereco do Customer e ver a impressao no console, registre o handler de CustomerAddressChangedEvent, altere o endereco do Customer, instancie o evento com id, name e address e chame notify.</w:t>
       </w:r>
     </w:p>
     <w:p>
@@ -2811,7 +2295,7 @@
         <w:spacing w:after="120" w:before="260"/>
       </w:pPr>
       <w:r>
-        <w:t xml:space="preserve">6.2 CustomerAddressChangedEvent</w:t>
+        <w:t xml:space="preserve">5.2 Troca de Endereco</w:t>
       </w:r>
     </w:p>
     <w:p>
@@ -2832,67 +2316,47 @@
           <w:sz w:val="17"/>
           <w:szCs w:val="17"/>
         </w:rPr>
-        <w:t xml:space="preserve">it("should notify handler when a customer address is changed", () =&gt; {</w:t>
-      </w:r>
-      <w:r>
-        <w:rPr>
-          <w:rFonts w:ascii="Consolas" w:cs="Consolas" w:eastAsia="Consolas" w:hAnsi="Consolas"/>
-          <w:color w:val="1F2937"/>
-          <w:sz w:val="17"/>
-          <w:szCs w:val="17"/>
-        </w:rPr>
-        <w:br/>
-        <w:t xml:space="preserve">    const eventDispatcher = new EventDispatcher();</w:t>
-      </w:r>
-      <w:r>
-        <w:rPr>
-          <w:rFonts w:ascii="Consolas" w:cs="Consolas" w:eastAsia="Consolas" w:hAnsi="Consolas"/>
-          <w:color w:val="1F2937"/>
-          <w:sz w:val="17"/>
-          <w:szCs w:val="17"/>
-        </w:rPr>
-        <w:br/>
-        <w:t xml:space="preserve">    const handler = new EnviaConsoleLogHandler();</w:t>
-      </w:r>
-      <w:r>
-        <w:rPr>
-          <w:rFonts w:ascii="Consolas" w:cs="Consolas" w:eastAsia="Consolas" w:hAnsi="Consolas"/>
-          <w:color w:val="1F2937"/>
-          <w:sz w:val="17"/>
-          <w:szCs w:val="17"/>
-        </w:rPr>
-        <w:br/>
-        <w:t xml:space="preserve">    const spyHandler = jest.spyOn(handler, "handle");</w:t>
-      </w:r>
-      <w:r>
-        <w:rPr>
-          <w:rFonts w:ascii="Consolas" w:cs="Consolas" w:eastAsia="Consolas" w:hAnsi="Consolas"/>
-          <w:color w:val="1F2937"/>
-          <w:sz w:val="17"/>
-          <w:szCs w:val="17"/>
-        </w:rPr>
-        <w:br/>
-        <w:t xml:space="preserve">    const spyConsoleLog = jest</w:t>
-      </w:r>
-      <w:r>
-        <w:rPr>
-          <w:rFonts w:ascii="Consolas" w:cs="Consolas" w:eastAsia="Consolas" w:hAnsi="Consolas"/>
-          <w:color w:val="1F2937"/>
-          <w:sz w:val="17"/>
-          <w:szCs w:val="17"/>
-        </w:rPr>
-        <w:br/>
-        <w:t xml:space="preserve">      .spyOn(console, "log")</w:t>
-      </w:r>
-      <w:r>
-        <w:rPr>
-          <w:rFonts w:ascii="Consolas" w:cs="Consolas" w:eastAsia="Consolas" w:hAnsi="Consolas"/>
-          <w:color w:val="1F2937"/>
-          <w:sz w:val="17"/>
-          <w:szCs w:val="17"/>
-        </w:rPr>
-        <w:br/>
-        <w:t xml:space="preserve">      .mockImplementation(() =&gt; {});</w:t>
+        <w:t xml:space="preserve">import EventDispatcher from "./src/domain/@shared/event/event-dispatcher";</w:t>
+      </w:r>
+      <w:r>
+        <w:rPr>
+          <w:rFonts w:ascii="Consolas" w:cs="Consolas" w:eastAsia="Consolas" w:hAnsi="Consolas"/>
+          <w:color w:val="1F2937"/>
+          <w:sz w:val="17"/>
+          <w:szCs w:val="17"/>
+        </w:rPr>
+        <w:br/>
+        <w:t xml:space="preserve">import Customer from "./src/domain/customer/entity/customer";</w:t>
+      </w:r>
+      <w:r>
+        <w:rPr>
+          <w:rFonts w:ascii="Consolas" w:cs="Consolas" w:eastAsia="Consolas" w:hAnsi="Consolas"/>
+          <w:color w:val="1F2937"/>
+          <w:sz w:val="17"/>
+          <w:szCs w:val="17"/>
+        </w:rPr>
+        <w:br/>
+        <w:t xml:space="preserve">import Address from "./src/domain/customer/value-object/address";</w:t>
+      </w:r>
+      <w:r>
+        <w:rPr>
+          <w:rFonts w:ascii="Consolas" w:cs="Consolas" w:eastAsia="Consolas" w:hAnsi="Consolas"/>
+          <w:color w:val="1F2937"/>
+          <w:sz w:val="17"/>
+          <w:szCs w:val="17"/>
+        </w:rPr>
+        <w:br/>
+        <w:t xml:space="preserve">import CustomerAddressChangedEvent from "./src/domain/customer/event/customer-address-changed.event";</w:t>
+      </w:r>
+      <w:r>
+        <w:rPr>
+          <w:rFonts w:ascii="Consolas" w:cs="Consolas" w:eastAsia="Consolas" w:hAnsi="Consolas"/>
+          <w:color w:val="1F2937"/>
+          <w:sz w:val="17"/>
+          <w:szCs w:val="17"/>
+        </w:rPr>
+        <w:br/>
+        <w:t xml:space="preserve">import EnviaConsoleLogHandler from "./src/domain/customer/event/handler/envia-console-log.handler";</w:t>
       </w:r>
       <w:r>
         <w:rPr>
@@ -2912,7 +2376,17 @@
           <w:szCs w:val="17"/>
         </w:rPr>
         <w:br/>
-        <w:t xml:space="preserve">    eventDispatcher.register("CustomerAddressChangedEvent", handler);</w:t>
+        <w:t xml:space="preserve">const eventDispatcher = new EventDispatcher();</w:t>
+      </w:r>
+      <w:r>
+        <w:rPr>
+          <w:rFonts w:ascii="Consolas" w:cs="Consolas" w:eastAsia="Consolas" w:hAnsi="Consolas"/>
+          <w:color w:val="1F2937"/>
+          <w:sz w:val="17"/>
+          <w:szCs w:val="17"/>
+        </w:rPr>
+        <w:br/>
+        <w:t xml:space="preserve">eventDispatcher.register("CustomerAddressChangedEvent", new EnviaConsoleLogHandler());</w:t>
       </w:r>
       <w:r>
         <w:rPr>
@@ -2932,27 +2406,27 @@
           <w:szCs w:val="17"/>
         </w:rPr>
         <w:br/>
-        <w:t xml:space="preserve">    const customer = new Customer("123", "Customer 1");</w:t>
-      </w:r>
-      <w:r>
-        <w:rPr>
-          <w:rFonts w:ascii="Consolas" w:cs="Consolas" w:eastAsia="Consolas" w:hAnsi="Consolas"/>
-          <w:color w:val="1F2937"/>
-          <w:sz w:val="17"/>
-          <w:szCs w:val="17"/>
-        </w:rPr>
-        <w:br/>
-        <w:t xml:space="preserve">    const address = new Address("Street 1", 10, "12345-000", "Sao Paulo");</w:t>
-      </w:r>
-      <w:r>
-        <w:rPr>
-          <w:rFonts w:ascii="Consolas" w:cs="Consolas" w:eastAsia="Consolas" w:hAnsi="Consolas"/>
-          <w:color w:val="1F2937"/>
-          <w:sz w:val="17"/>
-          <w:szCs w:val="17"/>
-        </w:rPr>
-        <w:br/>
-        <w:t xml:space="preserve">    customer.changeAddress(address);</w:t>
+        <w:t xml:space="preserve">const customer = new Customer("123", "Customer 1");</w:t>
+      </w:r>
+      <w:r>
+        <w:rPr>
+          <w:rFonts w:ascii="Consolas" w:cs="Consolas" w:eastAsia="Consolas" w:hAnsi="Consolas"/>
+          <w:color w:val="1F2937"/>
+          <w:sz w:val="17"/>
+          <w:szCs w:val="17"/>
+        </w:rPr>
+        <w:br/>
+        <w:t xml:space="preserve">const address = new Address("Street 1", 10, "12345-000", "Sao Paulo");</w:t>
+      </w:r>
+      <w:r>
+        <w:rPr>
+          <w:rFonts w:ascii="Consolas" w:cs="Consolas" w:eastAsia="Consolas" w:hAnsi="Consolas"/>
+          <w:color w:val="1F2937"/>
+          <w:sz w:val="17"/>
+          <w:szCs w:val="17"/>
+        </w:rPr>
+        <w:br/>
+        <w:t xml:space="preserve">customer.changeAddress(address);</w:t>
       </w:r>
       <w:r>
         <w:rPr>
@@ -2972,47 +2446,47 @@
           <w:szCs w:val="17"/>
         </w:rPr>
         <w:br/>
-        <w:t xml:space="preserve">    const customerAddressChangedEvent = new CustomerAddressChangedEvent({</w:t>
-      </w:r>
-      <w:r>
-        <w:rPr>
-          <w:rFonts w:ascii="Consolas" w:cs="Consolas" w:eastAsia="Consolas" w:hAnsi="Consolas"/>
-          <w:color w:val="1F2937"/>
-          <w:sz w:val="17"/>
-          <w:szCs w:val="17"/>
-        </w:rPr>
-        <w:br/>
-        <w:t xml:space="preserve">      id: customer.id,</w:t>
-      </w:r>
-      <w:r>
-        <w:rPr>
-          <w:rFonts w:ascii="Consolas" w:cs="Consolas" w:eastAsia="Consolas" w:hAnsi="Consolas"/>
-          <w:color w:val="1F2937"/>
-          <w:sz w:val="17"/>
-          <w:szCs w:val="17"/>
-        </w:rPr>
-        <w:br/>
-        <w:t xml:space="preserve">      name: customer.name,</w:t>
-      </w:r>
-      <w:r>
-        <w:rPr>
-          <w:rFonts w:ascii="Consolas" w:cs="Consolas" w:eastAsia="Consolas" w:hAnsi="Consolas"/>
-          <w:color w:val="1F2937"/>
-          <w:sz w:val="17"/>
-          <w:szCs w:val="17"/>
-        </w:rPr>
-        <w:br/>
-        <w:t xml:space="preserve">      address,</w:t>
-      </w:r>
-      <w:r>
-        <w:rPr>
-          <w:rFonts w:ascii="Consolas" w:cs="Consolas" w:eastAsia="Consolas" w:hAnsi="Consolas"/>
-          <w:color w:val="1F2937"/>
-          <w:sz w:val="17"/>
-          <w:szCs w:val="17"/>
-        </w:rPr>
-        <w:br/>
-        <w:t xml:space="preserve">    });</w:t>
+        <w:t xml:space="preserve">const customerAddressChangedEvent = new CustomerAddressChangedEvent({</w:t>
+      </w:r>
+      <w:r>
+        <w:rPr>
+          <w:rFonts w:ascii="Consolas" w:cs="Consolas" w:eastAsia="Consolas" w:hAnsi="Consolas"/>
+          <w:color w:val="1F2937"/>
+          <w:sz w:val="17"/>
+          <w:szCs w:val="17"/>
+        </w:rPr>
+        <w:br/>
+        <w:t xml:space="preserve">  id: customer.id,</w:t>
+      </w:r>
+      <w:r>
+        <w:rPr>
+          <w:rFonts w:ascii="Consolas" w:cs="Consolas" w:eastAsia="Consolas" w:hAnsi="Consolas"/>
+          <w:color w:val="1F2937"/>
+          <w:sz w:val="17"/>
+          <w:szCs w:val="17"/>
+        </w:rPr>
+        <w:br/>
+        <w:t xml:space="preserve">  name: customer.name,</w:t>
+      </w:r>
+      <w:r>
+        <w:rPr>
+          <w:rFonts w:ascii="Consolas" w:cs="Consolas" w:eastAsia="Consolas" w:hAnsi="Consolas"/>
+          <w:color w:val="1F2937"/>
+          <w:sz w:val="17"/>
+          <w:szCs w:val="17"/>
+        </w:rPr>
+        <w:br/>
+        <w:t xml:space="preserve">  address,</w:t>
+      </w:r>
+      <w:r>
+        <w:rPr>
+          <w:rFonts w:ascii="Consolas" w:cs="Consolas" w:eastAsia="Consolas" w:hAnsi="Consolas"/>
+          <w:color w:val="1F2937"/>
+          <w:sz w:val="17"/>
+          <w:szCs w:val="17"/>
+        </w:rPr>
+        <w:br/>
+        <w:t xml:space="preserve">});</w:t>
       </w:r>
       <w:r>
         <w:rPr>
@@ -3032,160 +2506,7 @@
           <w:szCs w:val="17"/>
         </w:rPr>
         <w:br/>
-        <w:t xml:space="preserve">    eventDispatcher.notify(customerAddressChangedEvent);</w:t>
-      </w:r>
-      <w:r>
-        <w:rPr>
-          <w:rFonts w:ascii="Consolas" w:cs="Consolas" w:eastAsia="Consolas" w:hAnsi="Consolas"/>
-          <w:color w:val="1F2937"/>
-          <w:sz w:val="17"/>
-          <w:szCs w:val="17"/>
-        </w:rPr>
-        <w:br/>
-        <w:t xml:space="preserve"> </w:t>
-      </w:r>
-      <w:r>
-        <w:rPr>
-          <w:rFonts w:ascii="Consolas" w:cs="Consolas" w:eastAsia="Consolas" w:hAnsi="Consolas"/>
-          <w:color w:val="1F2937"/>
-          <w:sz w:val="17"/>
-          <w:szCs w:val="17"/>
-        </w:rPr>
-        <w:br/>
-        <w:t xml:space="preserve">    expect(customerAddressChangedEvent.eventData).toStrictEqual({</w:t>
-      </w:r>
-      <w:r>
-        <w:rPr>
-          <w:rFonts w:ascii="Consolas" w:cs="Consolas" w:eastAsia="Consolas" w:hAnsi="Consolas"/>
-          <w:color w:val="1F2937"/>
-          <w:sz w:val="17"/>
-          <w:szCs w:val="17"/>
-        </w:rPr>
-        <w:br/>
-        <w:t xml:space="preserve">      id: "123",</w:t>
-      </w:r>
-      <w:r>
-        <w:rPr>
-          <w:rFonts w:ascii="Consolas" w:cs="Consolas" w:eastAsia="Consolas" w:hAnsi="Consolas"/>
-          <w:color w:val="1F2937"/>
-          <w:sz w:val="17"/>
-          <w:szCs w:val="17"/>
-        </w:rPr>
-        <w:br/>
-        <w:t xml:space="preserve">      name: "Customer 1",</w:t>
-      </w:r>
-      <w:r>
-        <w:rPr>
-          <w:rFonts w:ascii="Consolas" w:cs="Consolas" w:eastAsia="Consolas" w:hAnsi="Consolas"/>
-          <w:color w:val="1F2937"/>
-          <w:sz w:val="17"/>
-          <w:szCs w:val="17"/>
-        </w:rPr>
-        <w:br/>
-        <w:t xml:space="preserve">      address,</w:t>
-      </w:r>
-      <w:r>
-        <w:rPr>
-          <w:rFonts w:ascii="Consolas" w:cs="Consolas" w:eastAsia="Consolas" w:hAnsi="Consolas"/>
-          <w:color w:val="1F2937"/>
-          <w:sz w:val="17"/>
-          <w:szCs w:val="17"/>
-        </w:rPr>
-        <w:br/>
-        <w:t xml:space="preserve">    });</w:t>
-      </w:r>
-      <w:r>
-        <w:rPr>
-          <w:rFonts w:ascii="Consolas" w:cs="Consolas" w:eastAsia="Consolas" w:hAnsi="Consolas"/>
-          <w:color w:val="1F2937"/>
-          <w:sz w:val="17"/>
-          <w:szCs w:val="17"/>
-        </w:rPr>
-        <w:br/>
-        <w:t xml:space="preserve">    expect(spyHandler).toHaveBeenCalledWith(customerAddressChangedEvent);</w:t>
-      </w:r>
-      <w:r>
-        <w:rPr>
-          <w:rFonts w:ascii="Consolas" w:cs="Consolas" w:eastAsia="Consolas" w:hAnsi="Consolas"/>
-          <w:color w:val="1F2937"/>
-          <w:sz w:val="17"/>
-          <w:szCs w:val="17"/>
-        </w:rPr>
-        <w:br/>
-        <w:t xml:space="preserve">    expect(spyConsoleLog).toHaveBeenCalledWith(</w:t>
-      </w:r>
-      <w:r>
-        <w:rPr>
-          <w:rFonts w:ascii="Consolas" w:cs="Consolas" w:eastAsia="Consolas" w:hAnsi="Consolas"/>
-          <w:color w:val="1F2937"/>
-          <w:sz w:val="17"/>
-          <w:szCs w:val="17"/>
-        </w:rPr>
-        <w:br/>
-        <w:t xml:space="preserve">      "Endereço do cliente: 123, Customer 1 alterado para: Street 1, 10, 12345-000 Sao Paulo"</w:t>
-      </w:r>
-      <w:r>
-        <w:rPr>
-          <w:rFonts w:ascii="Consolas" w:cs="Consolas" w:eastAsia="Consolas" w:hAnsi="Consolas"/>
-          <w:color w:val="1F2937"/>
-          <w:sz w:val="17"/>
-          <w:szCs w:val="17"/>
-        </w:rPr>
-        <w:br/>
-        <w:t xml:space="preserve">    );</w:t>
-      </w:r>
-      <w:r>
-        <w:rPr>
-          <w:rFonts w:ascii="Consolas" w:cs="Consolas" w:eastAsia="Consolas" w:hAnsi="Consolas"/>
-          <w:color w:val="1F2937"/>
-          <w:sz w:val="17"/>
-          <w:szCs w:val="17"/>
-        </w:rPr>
-        <w:br/>
-        <w:t xml:space="preserve">    expect(spyConsoleLog).toHaveBeenCalledTimes(1);</w:t>
-      </w:r>
-      <w:r>
-        <w:rPr>
-          <w:rFonts w:ascii="Consolas" w:cs="Consolas" w:eastAsia="Consolas" w:hAnsi="Consolas"/>
-          <w:color w:val="1F2937"/>
-          <w:sz w:val="17"/>
-          <w:szCs w:val="17"/>
-        </w:rPr>
-        <w:br/>
-        <w:t xml:space="preserve">  });</w:t>
-      </w:r>
-    </w:p>
-    <w:p>
-      <w:pPr>
-        <w:pStyle w:val="Heading1"/>
-        <w:spacing w:after="120" w:before="260"/>
-      </w:pPr>
-      <w:r>
-        <w:t xml:space="preserve">7. Resultado dos Testes</w:t>
-      </w:r>
-    </w:p>
-    <w:p>
-      <w:pPr>
-        <w:spacing w:after="80" w:before="80"/>
-      </w:pPr>
-      <w:r>
-        <w:rPr>
-          <w:rFonts w:ascii="Calibri" w:cs="Calibri" w:eastAsia="Calibri" w:hAnsi="Calibri"/>
-          <w:b/>
-          <w:bCs/>
-          <w:sz w:val="22"/>
-          <w:szCs w:val="22"/>
-        </w:rPr>
-        <w:t xml:space="preserve">Comando executado: </w:t>
-      </w:r>
-      <w:r>
-        <w:rPr>
-          <w:rFonts w:ascii="Consolas" w:cs="Consolas" w:eastAsia="Consolas" w:hAnsi="Consolas"/>
-          <w:color w:val="0369A1"/>
-          <w:sz w:val="22"/>
-          <w:szCs w:val="22"/>
-        </w:rPr>
-        <w:t xml:space="preserve">npm.cmd test</w:t>
+        <w:t xml:space="preserve">eventDispatcher.notify(customerAddressChangedEvent);</w:t>
       </w:r>
     </w:p>
     <w:p>
@@ -3198,7 +2519,7 @@
           <w:sz w:val="22"/>
           <w:szCs w:val="22"/>
         </w:rPr>
-        <w:t xml:space="preserve">Evidencia em arquivo: Analise/npm-test-evento-customer-resultado.txt</w:t>
+        <w:t xml:space="preserve">Saida esperada no console:</w:t>
       </w:r>
     </w:p>
     <w:p>
@@ -3219,337 +2540,61 @@
           <w:sz w:val="17"/>
           <w:szCs w:val="17"/>
         </w:rPr>
-        <w:t xml:space="preserve">&gt; test</w:t>
-      </w:r>
-      <w:r>
-        <w:rPr>
-          <w:rFonts w:ascii="Consolas" w:cs="Consolas" w:eastAsia="Consolas" w:hAnsi="Consolas"/>
-          <w:color w:val="1F2937"/>
-          <w:sz w:val="17"/>
-          <w:szCs w:val="17"/>
-        </w:rPr>
-        <w:br/>
-        <w:t xml:space="preserve">&gt; npm run tsc -- --noEmit &amp;&amp; jest</w:t>
-      </w:r>
-      <w:r>
-        <w:rPr>
-          <w:rFonts w:ascii="Consolas" w:cs="Consolas" w:eastAsia="Consolas" w:hAnsi="Consolas"/>
-          <w:color w:val="1F2937"/>
-          <w:sz w:val="17"/>
-          <w:szCs w:val="17"/>
-        </w:rPr>
-        <w:br/>
-        <w:t xml:space="preserve"> </w:t>
-      </w:r>
-      <w:r>
-        <w:rPr>
-          <w:rFonts w:ascii="Consolas" w:cs="Consolas" w:eastAsia="Consolas" w:hAnsi="Consolas"/>
-          <w:color w:val="1F2937"/>
-          <w:sz w:val="17"/>
-          <w:szCs w:val="17"/>
-        </w:rPr>
-        <w:br/>
-        <w:t xml:space="preserve"> </w:t>
-      </w:r>
-      <w:r>
-        <w:rPr>
-          <w:rFonts w:ascii="Consolas" w:cs="Consolas" w:eastAsia="Consolas" w:hAnsi="Consolas"/>
-          <w:color w:val="1F2937"/>
-          <w:sz w:val="17"/>
-          <w:szCs w:val="17"/>
-        </w:rPr>
-        <w:br/>
-        <w:t xml:space="preserve">&gt; tsc</w:t>
-      </w:r>
-      <w:r>
-        <w:rPr>
-          <w:rFonts w:ascii="Consolas" w:cs="Consolas" w:eastAsia="Consolas" w:hAnsi="Consolas"/>
-          <w:color w:val="1F2937"/>
-          <w:sz w:val="17"/>
-          <w:szCs w:val="17"/>
-        </w:rPr>
-        <w:br/>
-        <w:t xml:space="preserve">&gt; tsc --noEmit</w:t>
-      </w:r>
-      <w:r>
-        <w:rPr>
-          <w:rFonts w:ascii="Consolas" w:cs="Consolas" w:eastAsia="Consolas" w:hAnsi="Consolas"/>
-          <w:color w:val="1F2937"/>
-          <w:sz w:val="17"/>
-          <w:szCs w:val="17"/>
-        </w:rPr>
-        <w:br/>
-        <w:t xml:space="preserve"> </w:t>
-      </w:r>
-      <w:r>
-        <w:rPr>
-          <w:rFonts w:ascii="Consolas" w:cs="Consolas" w:eastAsia="Consolas" w:hAnsi="Consolas"/>
-          <w:color w:val="1F2937"/>
-          <w:sz w:val="17"/>
-          <w:szCs w:val="17"/>
-        </w:rPr>
-        <w:br/>
-        <w:t xml:space="preserve">PASS src/domain/customer/factory/customer.factory.spec.ts</w:t>
-      </w:r>
-      <w:r>
-        <w:rPr>
-          <w:rFonts w:ascii="Consolas" w:cs="Consolas" w:eastAsia="Consolas" w:hAnsi="Consolas"/>
-          <w:color w:val="1F2937"/>
-          <w:sz w:val="17"/>
-          <w:szCs w:val="17"/>
-        </w:rPr>
-        <w:br/>
-        <w:t xml:space="preserve">PASS src/domain/@shared/event/event-dispatcher.spec.ts</w:t>
-      </w:r>
-      <w:r>
-        <w:rPr>
-          <w:rFonts w:ascii="Consolas" w:cs="Consolas" w:eastAsia="Consolas" w:hAnsi="Consolas"/>
-          <w:color w:val="1F2937"/>
-          <w:sz w:val="17"/>
-          <w:szCs w:val="17"/>
-        </w:rPr>
-        <w:br/>
-        <w:t xml:space="preserve">  ● Console</w:t>
-      </w:r>
-      <w:r>
-        <w:rPr>
-          <w:rFonts w:ascii="Consolas" w:cs="Consolas" w:eastAsia="Consolas" w:hAnsi="Consolas"/>
-          <w:color w:val="1F2937"/>
-          <w:sz w:val="17"/>
-          <w:szCs w:val="17"/>
-        </w:rPr>
-        <w:br/>
-        <w:t xml:space="preserve"> </w:t>
-      </w:r>
-      <w:r>
-        <w:rPr>
-          <w:rFonts w:ascii="Consolas" w:cs="Consolas" w:eastAsia="Consolas" w:hAnsi="Consolas"/>
-          <w:color w:val="1F2937"/>
-          <w:sz w:val="17"/>
-          <w:szCs w:val="17"/>
-        </w:rPr>
-        <w:br/>
-        <w:t xml:space="preserve">    console.log</w:t>
-      </w:r>
-      <w:r>
-        <w:rPr>
-          <w:rFonts w:ascii="Consolas" w:cs="Consolas" w:eastAsia="Consolas" w:hAnsi="Consolas"/>
-          <w:color w:val="1F2937"/>
-          <w:sz w:val="17"/>
-          <w:szCs w:val="17"/>
-        </w:rPr>
-        <w:br/>
-        <w:t xml:space="preserve">      Sending email to .....</w:t>
-      </w:r>
-      <w:r>
-        <w:rPr>
-          <w:rFonts w:ascii="Consolas" w:cs="Consolas" w:eastAsia="Consolas" w:hAnsi="Consolas"/>
-          <w:color w:val="1F2937"/>
-          <w:sz w:val="17"/>
-          <w:szCs w:val="17"/>
-        </w:rPr>
-        <w:br/>
-        <w:t xml:space="preserve"> </w:t>
-      </w:r>
-      <w:r>
-        <w:rPr>
-          <w:rFonts w:ascii="Consolas" w:cs="Consolas" w:eastAsia="Consolas" w:hAnsi="Consolas"/>
-          <w:color w:val="1F2937"/>
-          <w:sz w:val="17"/>
-          <w:szCs w:val="17"/>
-        </w:rPr>
-        <w:br/>
-        <w:t xml:space="preserve">      at SendEmailWhenProductIsCreatedHandler.handle (src/domain/product/event/handler/send-email-when-product-is-created.handler.ts:8:13)</w:t>
-      </w:r>
-      <w:r>
-        <w:rPr>
-          <w:rFonts w:ascii="Consolas" w:cs="Consolas" w:eastAsia="Consolas" w:hAnsi="Consolas"/>
-          <w:color w:val="1F2937"/>
-          <w:sz w:val="17"/>
-          <w:szCs w:val="17"/>
-        </w:rPr>
-        <w:br/>
-        <w:t xml:space="preserve">          at Array.forEach (&lt;anonymous&gt;)</w:t>
-      </w:r>
-      <w:r>
-        <w:rPr>
-          <w:rFonts w:ascii="Consolas" w:cs="Consolas" w:eastAsia="Consolas" w:hAnsi="Consolas"/>
-          <w:color w:val="1F2937"/>
-          <w:sz w:val="17"/>
-          <w:szCs w:val="17"/>
-        </w:rPr>
-        <w:br/>
-        <w:t xml:space="preserve"> </w:t>
-      </w:r>
-      <w:r>
-        <w:rPr>
-          <w:rFonts w:ascii="Consolas" w:cs="Consolas" w:eastAsia="Consolas" w:hAnsi="Consolas"/>
-          <w:color w:val="1F2937"/>
-          <w:sz w:val="17"/>
-          <w:szCs w:val="17"/>
-        </w:rPr>
-        <w:br/>
-        <w:t xml:space="preserve">PASS src/domain/customer/event/customer-event-dispatcher.spec.ts</w:t>
-      </w:r>
-      <w:r>
-        <w:rPr>
-          <w:rFonts w:ascii="Consolas" w:cs="Consolas" w:eastAsia="Consolas" w:hAnsi="Consolas"/>
-          <w:color w:val="1F2937"/>
-          <w:sz w:val="17"/>
-          <w:szCs w:val="17"/>
-        </w:rPr>
-        <w:br/>
-        <w:t xml:space="preserve">PASS src/domain/customer/entity/customer.spec.ts</w:t>
-      </w:r>
-      <w:r>
-        <w:rPr>
-          <w:rFonts w:ascii="Consolas" w:cs="Consolas" w:eastAsia="Consolas" w:hAnsi="Consolas"/>
-          <w:color w:val="1F2937"/>
-          <w:sz w:val="17"/>
-          <w:szCs w:val="17"/>
-        </w:rPr>
-        <w:br/>
-        <w:t xml:space="preserve">PASS src/domain/product/service/product.service.spec.ts</w:t>
-      </w:r>
-      <w:r>
-        <w:rPr>
-          <w:rFonts w:ascii="Consolas" w:cs="Consolas" w:eastAsia="Consolas" w:hAnsi="Consolas"/>
-          <w:color w:val="1F2937"/>
-          <w:sz w:val="17"/>
-          <w:szCs w:val="17"/>
-        </w:rPr>
-        <w:br/>
-        <w:t xml:space="preserve">PASS src/domain/checkout/entity/order.spec.ts</w:t>
-      </w:r>
-      <w:r>
-        <w:rPr>
-          <w:rFonts w:ascii="Consolas" w:cs="Consolas" w:eastAsia="Consolas" w:hAnsi="Consolas"/>
-          <w:color w:val="1F2937"/>
-          <w:sz w:val="17"/>
-          <w:szCs w:val="17"/>
-        </w:rPr>
-        <w:br/>
-        <w:t xml:space="preserve">PASS src/domain/checkout/service/order.service.spec.ts</w:t>
-      </w:r>
-      <w:r>
-        <w:rPr>
-          <w:rFonts w:ascii="Consolas" w:cs="Consolas" w:eastAsia="Consolas" w:hAnsi="Consolas"/>
-          <w:color w:val="1F2937"/>
-          <w:sz w:val="17"/>
-          <w:szCs w:val="17"/>
-        </w:rPr>
-        <w:br/>
-        <w:t xml:space="preserve">PASS src/domain/product/entity/product.spec.ts</w:t>
-      </w:r>
-      <w:r>
-        <w:rPr>
-          <w:rFonts w:ascii="Consolas" w:cs="Consolas" w:eastAsia="Consolas" w:hAnsi="Consolas"/>
-          <w:color w:val="1F2937"/>
-          <w:sz w:val="17"/>
-          <w:szCs w:val="17"/>
-        </w:rPr>
-        <w:br/>
-        <w:t xml:space="preserve">PASS src/domain/checkout/factory/order.factory.spec.ts</w:t>
-      </w:r>
-      <w:r>
-        <w:rPr>
-          <w:rFonts w:ascii="Consolas" w:cs="Consolas" w:eastAsia="Consolas" w:hAnsi="Consolas"/>
-          <w:color w:val="1F2937"/>
-          <w:sz w:val="17"/>
-          <w:szCs w:val="17"/>
-        </w:rPr>
-        <w:br/>
-        <w:t xml:space="preserve">PASS src/domain/product/factory/product.factory.spec.ts</w:t>
-      </w:r>
-      <w:r>
-        <w:rPr>
-          <w:rFonts w:ascii="Consolas" w:cs="Consolas" w:eastAsia="Consolas" w:hAnsi="Consolas"/>
-          <w:color w:val="1F2937"/>
-          <w:sz w:val="17"/>
-          <w:szCs w:val="17"/>
-        </w:rPr>
-        <w:br/>
-        <w:t xml:space="preserve">PASS src/infrastructure/customer/repository/sequelize/customer.repository.spec.ts</w:t>
-      </w:r>
-      <w:r>
-        <w:rPr>
-          <w:rFonts w:ascii="Consolas" w:cs="Consolas" w:eastAsia="Consolas" w:hAnsi="Consolas"/>
-          <w:color w:val="1F2937"/>
-          <w:sz w:val="17"/>
-          <w:szCs w:val="17"/>
-        </w:rPr>
-        <w:br/>
-        <w:t xml:space="preserve">PASS src/infrastructure/product/repository/sequelize/product.repository.spec.ts</w:t>
-      </w:r>
-      <w:r>
-        <w:rPr>
-          <w:rFonts w:ascii="Consolas" w:cs="Consolas" w:eastAsia="Consolas" w:hAnsi="Consolas"/>
-          <w:color w:val="1F2937"/>
-          <w:sz w:val="17"/>
-          <w:szCs w:val="17"/>
-        </w:rPr>
-        <w:br/>
-        <w:t xml:space="preserve">PASS src/infrastructure/order/repository/sequilize/order.repository.spec.ts</w:t>
-      </w:r>
-      <w:r>
-        <w:rPr>
-          <w:rFonts w:ascii="Consolas" w:cs="Consolas" w:eastAsia="Consolas" w:hAnsi="Consolas"/>
-          <w:color w:val="1F2937"/>
-          <w:sz w:val="17"/>
-          <w:szCs w:val="17"/>
-        </w:rPr>
-        <w:br/>
-        <w:t xml:space="preserve"> </w:t>
-      </w:r>
-      <w:r>
-        <w:rPr>
-          <w:rFonts w:ascii="Consolas" w:cs="Consolas" w:eastAsia="Consolas" w:hAnsi="Consolas"/>
-          <w:color w:val="1F2937"/>
-          <w:sz w:val="17"/>
-          <w:szCs w:val="17"/>
-        </w:rPr>
-        <w:br/>
-        <w:t xml:space="preserve">Test Suites: 13 passed, 13 total</w:t>
-      </w:r>
-      <w:r>
-        <w:rPr>
-          <w:rFonts w:ascii="Consolas" w:cs="Consolas" w:eastAsia="Consolas" w:hAnsi="Consolas"/>
-          <w:color w:val="1F2937"/>
-          <w:sz w:val="17"/>
-          <w:szCs w:val="17"/>
-        </w:rPr>
-        <w:br/>
-        <w:t xml:space="preserve">Tests:       46 passed, 46 total</w:t>
-      </w:r>
-      <w:r>
-        <w:rPr>
-          <w:rFonts w:ascii="Consolas" w:cs="Consolas" w:eastAsia="Consolas" w:hAnsi="Consolas"/>
-          <w:color w:val="1F2937"/>
-          <w:sz w:val="17"/>
-          <w:szCs w:val="17"/>
-        </w:rPr>
-        <w:br/>
-        <w:t xml:space="preserve">Snapshots:   0 total</w:t>
-      </w:r>
-      <w:r>
-        <w:rPr>
-          <w:rFonts w:ascii="Consolas" w:cs="Consolas" w:eastAsia="Consolas" w:hAnsi="Consolas"/>
-          <w:color w:val="1F2937"/>
-          <w:sz w:val="17"/>
-          <w:szCs w:val="17"/>
-        </w:rPr>
-        <w:br/>
-        <w:t xml:space="preserve">Time:        2.35 s</w:t>
-      </w:r>
-      <w:r>
-        <w:rPr>
-          <w:rFonts w:ascii="Consolas" w:cs="Consolas" w:eastAsia="Consolas" w:hAnsi="Consolas"/>
-          <w:color w:val="1F2937"/>
-          <w:sz w:val="17"/>
-          <w:szCs w:val="17"/>
-        </w:rPr>
-        <w:br/>
-        <w:t xml:space="preserve">Ran all test suites.</w:t>
+        <w:t xml:space="preserve">Endereço do cliente: 123, Customer 1 alterado para: Street 1, 10, 12345-000 Sao Paulo</w:t>
+      </w:r>
+    </w:p>
+    <w:p>
+      <w:pPr>
+        <w:spacing w:after="80" w:before="80"/>
+      </w:pPr>
+      <w:r>
+        <w:rPr>
+          <w:rFonts w:ascii="Calibri" w:cs="Calibri" w:eastAsia="Calibri" w:hAnsi="Calibri"/>
+          <w:sz w:val="22"/>
+          <w:szCs w:val="22"/>
+        </w:rPr>
+        <w:t xml:space="preserve">As tres impressoes foram consolidadas em Analise/consolelog.txt.</w:t>
+      </w:r>
+    </w:p>
+    <w:p>
+      <w:pPr>
+        <w:pBdr>
+          <w:top w:val="single" w:color="CBD5E1" w:sz="6"/>
+          <w:bottom w:val="single" w:color="CBD5E1" w:sz="6"/>
+          <w:left w:val="single" w:color="CBD5E1" w:sz="6"/>
+          <w:right w:val="single" w:color="CBD5E1" w:sz="6"/>
+        </w:pBdr>
+        <w:shd w:fill="F8FAFC" w:color="F8FAFC" w:val="clear"/>
+        <w:spacing w:after="160" w:before="100"/>
+      </w:pPr>
+      <w:r>
+        <w:rPr>
+          <w:rFonts w:ascii="Consolas" w:cs="Consolas" w:eastAsia="Consolas" w:hAnsi="Consolas"/>
+          <w:color w:val="1F2937"/>
+          <w:sz w:val="17"/>
+          <w:szCs w:val="17"/>
+        </w:rPr>
+        <w:t xml:space="preserve">Esse é o primeiro console.log do evento: CustomerCreated</w:t>
+      </w:r>
+      <w:r>
+        <w:rPr>
+          <w:rFonts w:ascii="Consolas" w:cs="Consolas" w:eastAsia="Consolas" w:hAnsi="Consolas"/>
+          <w:color w:val="1F2937"/>
+          <w:sz w:val="17"/>
+          <w:szCs w:val="17"/>
+        </w:rPr>
+        <w:br/>
+        <w:t xml:space="preserve">Esse é o segundo console.log do evento: CustomerCreated</w:t>
+      </w:r>
+      <w:r>
+        <w:rPr>
+          <w:rFonts w:ascii="Consolas" w:cs="Consolas" w:eastAsia="Consolas" w:hAnsi="Consolas"/>
+          <w:color w:val="1F2937"/>
+          <w:sz w:val="17"/>
+          <w:szCs w:val="17"/>
+        </w:rPr>
+        <w:br/>
+        <w:t xml:space="preserve">Endereço do cliente: 123, Customer 1 alterado para: Street 1, 10, 12345-000 Sao Paulo</w:t>
       </w:r>
     </w:p>
     <w:p>
@@ -3558,7 +2603,1539 @@
         <w:spacing w:after="120" w:before="260"/>
       </w:pPr>
       <w:r>
-        <w:t xml:space="preserve">8. Instrucoes para Rodar</w:t>
+        <w:t xml:space="preserve">6. Publicacao e Assinatura</w:t>
+      </w:r>
+    </w:p>
+    <w:p>
+      <w:pPr>
+        <w:spacing w:after="80" w:before="80"/>
+      </w:pPr>
+      <w:r>
+        <w:rPr>
+          <w:rFonts w:ascii="Calibri" w:cs="Calibri" w:eastAsia="Calibri" w:hAnsi="Calibri"/>
+          <w:sz w:val="22"/>
+          <w:szCs w:val="22"/>
+        </w:rPr>
+        <w:t xml:space="preserve">A publicacao e assinatura usam a classe EventDispatcher ja existente. Os handlers sao registrados pelo nome da classe do evento e executados quando notify recebe a instancia correspondente.</w:t>
+      </w:r>
+    </w:p>
+    <w:p>
+      <w:pPr>
+        <w:pBdr>
+          <w:top w:val="single" w:color="CBD5E1" w:sz="6"/>
+          <w:bottom w:val="single" w:color="CBD5E1" w:sz="6"/>
+          <w:left w:val="single" w:color="CBD5E1" w:sz="6"/>
+          <w:right w:val="single" w:color="CBD5E1" w:sz="6"/>
+        </w:pBdr>
+        <w:shd w:fill="F8FAFC" w:color="F8FAFC" w:val="clear"/>
+        <w:spacing w:after="160" w:before="100"/>
+      </w:pPr>
+      <w:r>
+        <w:rPr>
+          <w:rFonts w:ascii="Consolas" w:cs="Consolas" w:eastAsia="Consolas" w:hAnsi="Consolas"/>
+          <w:color w:val="1F2937"/>
+          <w:sz w:val="17"/>
+          <w:szCs w:val="17"/>
+        </w:rPr>
+        <w:t xml:space="preserve">import EventDispatcherInterface from "./event-dispatcher.interface";</w:t>
+      </w:r>
+      <w:r>
+        <w:rPr>
+          <w:rFonts w:ascii="Consolas" w:cs="Consolas" w:eastAsia="Consolas" w:hAnsi="Consolas"/>
+          <w:color w:val="1F2937"/>
+          <w:sz w:val="17"/>
+          <w:szCs w:val="17"/>
+        </w:rPr>
+        <w:br/>
+        <w:t xml:space="preserve">import EventHandlerInterface from "./event-handler.interface";</w:t>
+      </w:r>
+      <w:r>
+        <w:rPr>
+          <w:rFonts w:ascii="Consolas" w:cs="Consolas" w:eastAsia="Consolas" w:hAnsi="Consolas"/>
+          <w:color w:val="1F2937"/>
+          <w:sz w:val="17"/>
+          <w:szCs w:val="17"/>
+        </w:rPr>
+        <w:br/>
+        <w:t xml:space="preserve">import eventInterface from "./event.interface";</w:t>
+      </w:r>
+      <w:r>
+        <w:rPr>
+          <w:rFonts w:ascii="Consolas" w:cs="Consolas" w:eastAsia="Consolas" w:hAnsi="Consolas"/>
+          <w:color w:val="1F2937"/>
+          <w:sz w:val="17"/>
+          <w:szCs w:val="17"/>
+        </w:rPr>
+        <w:br/>
+        <w:t xml:space="preserve"> </w:t>
+      </w:r>
+      <w:r>
+        <w:rPr>
+          <w:rFonts w:ascii="Consolas" w:cs="Consolas" w:eastAsia="Consolas" w:hAnsi="Consolas"/>
+          <w:color w:val="1F2937"/>
+          <w:sz w:val="17"/>
+          <w:szCs w:val="17"/>
+        </w:rPr>
+        <w:br/>
+        <w:t xml:space="preserve">export default class EventDispatcher implements EventDispatcherInterface {</w:t>
+      </w:r>
+      <w:r>
+        <w:rPr>
+          <w:rFonts w:ascii="Consolas" w:cs="Consolas" w:eastAsia="Consolas" w:hAnsi="Consolas"/>
+          <w:color w:val="1F2937"/>
+          <w:sz w:val="17"/>
+          <w:szCs w:val="17"/>
+        </w:rPr>
+        <w:br/>
+        <w:t xml:space="preserve">  private eventHandlers: { [eventName: string]: EventHandlerInterface[] } = {};</w:t>
+      </w:r>
+      <w:r>
+        <w:rPr>
+          <w:rFonts w:ascii="Consolas" w:cs="Consolas" w:eastAsia="Consolas" w:hAnsi="Consolas"/>
+          <w:color w:val="1F2937"/>
+          <w:sz w:val="17"/>
+          <w:szCs w:val="17"/>
+        </w:rPr>
+        <w:br/>
+        <w:t xml:space="preserve"> </w:t>
+      </w:r>
+      <w:r>
+        <w:rPr>
+          <w:rFonts w:ascii="Consolas" w:cs="Consolas" w:eastAsia="Consolas" w:hAnsi="Consolas"/>
+          <w:color w:val="1F2937"/>
+          <w:sz w:val="17"/>
+          <w:szCs w:val="17"/>
+        </w:rPr>
+        <w:br/>
+        <w:t xml:space="preserve">  get getEventHandlers(): { [eventName: string]: EventHandlerInterface[] } {</w:t>
+      </w:r>
+      <w:r>
+        <w:rPr>
+          <w:rFonts w:ascii="Consolas" w:cs="Consolas" w:eastAsia="Consolas" w:hAnsi="Consolas"/>
+          <w:color w:val="1F2937"/>
+          <w:sz w:val="17"/>
+          <w:szCs w:val="17"/>
+        </w:rPr>
+        <w:br/>
+        <w:t xml:space="preserve">    return this.eventHandlers;</w:t>
+      </w:r>
+      <w:r>
+        <w:rPr>
+          <w:rFonts w:ascii="Consolas" w:cs="Consolas" w:eastAsia="Consolas" w:hAnsi="Consolas"/>
+          <w:color w:val="1F2937"/>
+          <w:sz w:val="17"/>
+          <w:szCs w:val="17"/>
+        </w:rPr>
+        <w:br/>
+        <w:t xml:space="preserve">  }</w:t>
+      </w:r>
+      <w:r>
+        <w:rPr>
+          <w:rFonts w:ascii="Consolas" w:cs="Consolas" w:eastAsia="Consolas" w:hAnsi="Consolas"/>
+          <w:color w:val="1F2937"/>
+          <w:sz w:val="17"/>
+          <w:szCs w:val="17"/>
+        </w:rPr>
+        <w:br/>
+        <w:t xml:space="preserve"> </w:t>
+      </w:r>
+      <w:r>
+        <w:rPr>
+          <w:rFonts w:ascii="Consolas" w:cs="Consolas" w:eastAsia="Consolas" w:hAnsi="Consolas"/>
+          <w:color w:val="1F2937"/>
+          <w:sz w:val="17"/>
+          <w:szCs w:val="17"/>
+        </w:rPr>
+        <w:br/>
+        <w:t xml:space="preserve">  register(eventName: string, eventHandler: EventHandlerInterface): void {</w:t>
+      </w:r>
+      <w:r>
+        <w:rPr>
+          <w:rFonts w:ascii="Consolas" w:cs="Consolas" w:eastAsia="Consolas" w:hAnsi="Consolas"/>
+          <w:color w:val="1F2937"/>
+          <w:sz w:val="17"/>
+          <w:szCs w:val="17"/>
+        </w:rPr>
+        <w:br/>
+        <w:t xml:space="preserve">    if (!this.eventHandlers[eventName]) {</w:t>
+      </w:r>
+      <w:r>
+        <w:rPr>
+          <w:rFonts w:ascii="Consolas" w:cs="Consolas" w:eastAsia="Consolas" w:hAnsi="Consolas"/>
+          <w:color w:val="1F2937"/>
+          <w:sz w:val="17"/>
+          <w:szCs w:val="17"/>
+        </w:rPr>
+        <w:br/>
+        <w:t xml:space="preserve">      this.eventHandlers[eventName] = [];</w:t>
+      </w:r>
+      <w:r>
+        <w:rPr>
+          <w:rFonts w:ascii="Consolas" w:cs="Consolas" w:eastAsia="Consolas" w:hAnsi="Consolas"/>
+          <w:color w:val="1F2937"/>
+          <w:sz w:val="17"/>
+          <w:szCs w:val="17"/>
+        </w:rPr>
+        <w:br/>
+        <w:t xml:space="preserve">    }</w:t>
+      </w:r>
+      <w:r>
+        <w:rPr>
+          <w:rFonts w:ascii="Consolas" w:cs="Consolas" w:eastAsia="Consolas" w:hAnsi="Consolas"/>
+          <w:color w:val="1F2937"/>
+          <w:sz w:val="17"/>
+          <w:szCs w:val="17"/>
+        </w:rPr>
+        <w:br/>
+        <w:t xml:space="preserve">    this.eventHandlers[eventName].push(eventHandler);</w:t>
+      </w:r>
+      <w:r>
+        <w:rPr>
+          <w:rFonts w:ascii="Consolas" w:cs="Consolas" w:eastAsia="Consolas" w:hAnsi="Consolas"/>
+          <w:color w:val="1F2937"/>
+          <w:sz w:val="17"/>
+          <w:szCs w:val="17"/>
+        </w:rPr>
+        <w:br/>
+        <w:t xml:space="preserve">  }</w:t>
+      </w:r>
+      <w:r>
+        <w:rPr>
+          <w:rFonts w:ascii="Consolas" w:cs="Consolas" w:eastAsia="Consolas" w:hAnsi="Consolas"/>
+          <w:color w:val="1F2937"/>
+          <w:sz w:val="17"/>
+          <w:szCs w:val="17"/>
+        </w:rPr>
+        <w:br/>
+        <w:t xml:space="preserve"> </w:t>
+      </w:r>
+      <w:r>
+        <w:rPr>
+          <w:rFonts w:ascii="Consolas" w:cs="Consolas" w:eastAsia="Consolas" w:hAnsi="Consolas"/>
+          <w:color w:val="1F2937"/>
+          <w:sz w:val="17"/>
+          <w:szCs w:val="17"/>
+        </w:rPr>
+        <w:br/>
+        <w:t xml:space="preserve">  unregister(eventName: string, eventHandler: EventHandlerInterface): void {</w:t>
+      </w:r>
+      <w:r>
+        <w:rPr>
+          <w:rFonts w:ascii="Consolas" w:cs="Consolas" w:eastAsia="Consolas" w:hAnsi="Consolas"/>
+          <w:color w:val="1F2937"/>
+          <w:sz w:val="17"/>
+          <w:szCs w:val="17"/>
+        </w:rPr>
+        <w:br/>
+        <w:t xml:space="preserve">    if (this.eventHandlers[eventName]) {</w:t>
+      </w:r>
+      <w:r>
+        <w:rPr>
+          <w:rFonts w:ascii="Consolas" w:cs="Consolas" w:eastAsia="Consolas" w:hAnsi="Consolas"/>
+          <w:color w:val="1F2937"/>
+          <w:sz w:val="17"/>
+          <w:szCs w:val="17"/>
+        </w:rPr>
+        <w:br/>
+        <w:t xml:space="preserve">      const index = this.eventHandlers[eventName].indexOf(eventHandler);</w:t>
+      </w:r>
+      <w:r>
+        <w:rPr>
+          <w:rFonts w:ascii="Consolas" w:cs="Consolas" w:eastAsia="Consolas" w:hAnsi="Consolas"/>
+          <w:color w:val="1F2937"/>
+          <w:sz w:val="17"/>
+          <w:szCs w:val="17"/>
+        </w:rPr>
+        <w:br/>
+        <w:t xml:space="preserve">      if (index !== -1) {</w:t>
+      </w:r>
+      <w:r>
+        <w:rPr>
+          <w:rFonts w:ascii="Consolas" w:cs="Consolas" w:eastAsia="Consolas" w:hAnsi="Consolas"/>
+          <w:color w:val="1F2937"/>
+          <w:sz w:val="17"/>
+          <w:szCs w:val="17"/>
+        </w:rPr>
+        <w:br/>
+        <w:t xml:space="preserve">        this.eventHandlers[eventName].splice(index, 1);</w:t>
+      </w:r>
+      <w:r>
+        <w:rPr>
+          <w:rFonts w:ascii="Consolas" w:cs="Consolas" w:eastAsia="Consolas" w:hAnsi="Consolas"/>
+          <w:color w:val="1F2937"/>
+          <w:sz w:val="17"/>
+          <w:szCs w:val="17"/>
+        </w:rPr>
+        <w:br/>
+        <w:t xml:space="preserve">      }</w:t>
+      </w:r>
+      <w:r>
+        <w:rPr>
+          <w:rFonts w:ascii="Consolas" w:cs="Consolas" w:eastAsia="Consolas" w:hAnsi="Consolas"/>
+          <w:color w:val="1F2937"/>
+          <w:sz w:val="17"/>
+          <w:szCs w:val="17"/>
+        </w:rPr>
+        <w:br/>
+        <w:t xml:space="preserve">    }</w:t>
+      </w:r>
+      <w:r>
+        <w:rPr>
+          <w:rFonts w:ascii="Consolas" w:cs="Consolas" w:eastAsia="Consolas" w:hAnsi="Consolas"/>
+          <w:color w:val="1F2937"/>
+          <w:sz w:val="17"/>
+          <w:szCs w:val="17"/>
+        </w:rPr>
+        <w:br/>
+        <w:t xml:space="preserve">  }</w:t>
+      </w:r>
+      <w:r>
+        <w:rPr>
+          <w:rFonts w:ascii="Consolas" w:cs="Consolas" w:eastAsia="Consolas" w:hAnsi="Consolas"/>
+          <w:color w:val="1F2937"/>
+          <w:sz w:val="17"/>
+          <w:szCs w:val="17"/>
+        </w:rPr>
+        <w:br/>
+        <w:t xml:space="preserve"> </w:t>
+      </w:r>
+      <w:r>
+        <w:rPr>
+          <w:rFonts w:ascii="Consolas" w:cs="Consolas" w:eastAsia="Consolas" w:hAnsi="Consolas"/>
+          <w:color w:val="1F2937"/>
+          <w:sz w:val="17"/>
+          <w:szCs w:val="17"/>
+        </w:rPr>
+        <w:br/>
+        <w:t xml:space="preserve">  unregisterAll(): void {</w:t>
+      </w:r>
+      <w:r>
+        <w:rPr>
+          <w:rFonts w:ascii="Consolas" w:cs="Consolas" w:eastAsia="Consolas" w:hAnsi="Consolas"/>
+          <w:color w:val="1F2937"/>
+          <w:sz w:val="17"/>
+          <w:szCs w:val="17"/>
+        </w:rPr>
+        <w:br/>
+        <w:t xml:space="preserve">    this.eventHandlers = {};</w:t>
+      </w:r>
+      <w:r>
+        <w:rPr>
+          <w:rFonts w:ascii="Consolas" w:cs="Consolas" w:eastAsia="Consolas" w:hAnsi="Consolas"/>
+          <w:color w:val="1F2937"/>
+          <w:sz w:val="17"/>
+          <w:szCs w:val="17"/>
+        </w:rPr>
+        <w:br/>
+        <w:t xml:space="preserve">  }</w:t>
+      </w:r>
+      <w:r>
+        <w:rPr>
+          <w:rFonts w:ascii="Consolas" w:cs="Consolas" w:eastAsia="Consolas" w:hAnsi="Consolas"/>
+          <w:color w:val="1F2937"/>
+          <w:sz w:val="17"/>
+          <w:szCs w:val="17"/>
+        </w:rPr>
+        <w:br/>
+        <w:t xml:space="preserve"> </w:t>
+      </w:r>
+      <w:r>
+        <w:rPr>
+          <w:rFonts w:ascii="Consolas" w:cs="Consolas" w:eastAsia="Consolas" w:hAnsi="Consolas"/>
+          <w:color w:val="1F2937"/>
+          <w:sz w:val="17"/>
+          <w:szCs w:val="17"/>
+        </w:rPr>
+        <w:br/>
+        <w:t xml:space="preserve">  notify(event: eventInterface): void {</w:t>
+      </w:r>
+      <w:r>
+        <w:rPr>
+          <w:rFonts w:ascii="Consolas" w:cs="Consolas" w:eastAsia="Consolas" w:hAnsi="Consolas"/>
+          <w:color w:val="1F2937"/>
+          <w:sz w:val="17"/>
+          <w:szCs w:val="17"/>
+        </w:rPr>
+        <w:br/>
+        <w:t xml:space="preserve">    const eventName = event.constructor.name;</w:t>
+      </w:r>
+      <w:r>
+        <w:rPr>
+          <w:rFonts w:ascii="Consolas" w:cs="Consolas" w:eastAsia="Consolas" w:hAnsi="Consolas"/>
+          <w:color w:val="1F2937"/>
+          <w:sz w:val="17"/>
+          <w:szCs w:val="17"/>
+        </w:rPr>
+        <w:br/>
+        <w:t xml:space="preserve">    if (this.eventHandlers[eventName]) {</w:t>
+      </w:r>
+      <w:r>
+        <w:rPr>
+          <w:rFonts w:ascii="Consolas" w:cs="Consolas" w:eastAsia="Consolas" w:hAnsi="Consolas"/>
+          <w:color w:val="1F2937"/>
+          <w:sz w:val="17"/>
+          <w:szCs w:val="17"/>
+        </w:rPr>
+        <w:br/>
+        <w:t xml:space="preserve">      this.eventHandlers[eventName].forEach((eventHandler) =&gt; {</w:t>
+      </w:r>
+      <w:r>
+        <w:rPr>
+          <w:rFonts w:ascii="Consolas" w:cs="Consolas" w:eastAsia="Consolas" w:hAnsi="Consolas"/>
+          <w:color w:val="1F2937"/>
+          <w:sz w:val="17"/>
+          <w:szCs w:val="17"/>
+        </w:rPr>
+        <w:br/>
+        <w:t xml:space="preserve">        eventHandler.handle(event);</w:t>
+      </w:r>
+      <w:r>
+        <w:rPr>
+          <w:rFonts w:ascii="Consolas" w:cs="Consolas" w:eastAsia="Consolas" w:hAnsi="Consolas"/>
+          <w:color w:val="1F2937"/>
+          <w:sz w:val="17"/>
+          <w:szCs w:val="17"/>
+        </w:rPr>
+        <w:br/>
+        <w:t xml:space="preserve">      });</w:t>
+      </w:r>
+      <w:r>
+        <w:rPr>
+          <w:rFonts w:ascii="Consolas" w:cs="Consolas" w:eastAsia="Consolas" w:hAnsi="Consolas"/>
+          <w:color w:val="1F2937"/>
+          <w:sz w:val="17"/>
+          <w:szCs w:val="17"/>
+        </w:rPr>
+        <w:br/>
+        <w:t xml:space="preserve">    }</w:t>
+      </w:r>
+      <w:r>
+        <w:rPr>
+          <w:rFonts w:ascii="Consolas" w:cs="Consolas" w:eastAsia="Consolas" w:hAnsi="Consolas"/>
+          <w:color w:val="1F2937"/>
+          <w:sz w:val="17"/>
+          <w:szCs w:val="17"/>
+        </w:rPr>
+        <w:br/>
+        <w:t xml:space="preserve">  }</w:t>
+      </w:r>
+      <w:r>
+        <w:rPr>
+          <w:rFonts w:ascii="Consolas" w:cs="Consolas" w:eastAsia="Consolas" w:hAnsi="Consolas"/>
+          <w:color w:val="1F2937"/>
+          <w:sz w:val="17"/>
+          <w:szCs w:val="17"/>
+        </w:rPr>
+        <w:br/>
+        <w:t xml:space="preserve">}</w:t>
+      </w:r>
+    </w:p>
+    <w:p>
+      <w:pPr>
+        <w:pStyle w:val="Heading1"/>
+        <w:spacing w:after="120" w:before="260"/>
+      </w:pPr>
+      <w:r>
+        <w:t xml:space="preserve">7. Testes Unitarios Implementados</w:t>
+      </w:r>
+    </w:p>
+    <w:p>
+      <w:pPr>
+        <w:spacing w:after="80" w:before="80"/>
+      </w:pPr>
+      <w:r>
+        <w:rPr>
+          <w:rFonts w:ascii="Calibri" w:cs="Calibri" w:eastAsia="Calibri" w:hAnsi="Calibri"/>
+          <w:sz w:val="22"/>
+          <w:szCs w:val="22"/>
+        </w:rPr>
+        <w:t xml:space="preserve">Os testes usam jest.spyOn nos metodos handle e em console.log. Isso garante tanto que os handlers foram chamados corretamente quanto que a saida de console exigida pelo desafio foi produzida.</w:t>
+      </w:r>
+    </w:p>
+    <w:p>
+      <w:pPr>
+        <w:pStyle w:val="Heading2"/>
+        <w:spacing w:after="120" w:before="260"/>
+      </w:pPr>
+      <w:r>
+        <w:t xml:space="preserve">7.1 CustomerCreatedEvent</w:t>
+      </w:r>
+    </w:p>
+    <w:p>
+      <w:pPr>
+        <w:pBdr>
+          <w:top w:val="single" w:color="CBD5E1" w:sz="6"/>
+          <w:bottom w:val="single" w:color="CBD5E1" w:sz="6"/>
+          <w:left w:val="single" w:color="CBD5E1" w:sz="6"/>
+          <w:right w:val="single" w:color="CBD5E1" w:sz="6"/>
+        </w:pBdr>
+        <w:shd w:fill="F8FAFC" w:color="F8FAFC" w:val="clear"/>
+        <w:spacing w:after="160" w:before="100"/>
+      </w:pPr>
+      <w:r>
+        <w:rPr>
+          <w:rFonts w:ascii="Consolas" w:cs="Consolas" w:eastAsia="Consolas" w:hAnsi="Consolas"/>
+          <w:color w:val="1F2937"/>
+          <w:sz w:val="17"/>
+          <w:szCs w:val="17"/>
+        </w:rPr>
+        <w:t xml:space="preserve">it("should notify two handlers when a customer is created", () =&gt; {</w:t>
+      </w:r>
+      <w:r>
+        <w:rPr>
+          <w:rFonts w:ascii="Consolas" w:cs="Consolas" w:eastAsia="Consolas" w:hAnsi="Consolas"/>
+          <w:color w:val="1F2937"/>
+          <w:sz w:val="17"/>
+          <w:szCs w:val="17"/>
+        </w:rPr>
+        <w:br/>
+        <w:t xml:space="preserve">    const eventDispatcher = new EventDispatcher();</w:t>
+      </w:r>
+      <w:r>
+        <w:rPr>
+          <w:rFonts w:ascii="Consolas" w:cs="Consolas" w:eastAsia="Consolas" w:hAnsi="Consolas"/>
+          <w:color w:val="1F2937"/>
+          <w:sz w:val="17"/>
+          <w:szCs w:val="17"/>
+        </w:rPr>
+        <w:br/>
+        <w:t xml:space="preserve">    const handler1 = new EnviaConsoleLog1Handler();</w:t>
+      </w:r>
+      <w:r>
+        <w:rPr>
+          <w:rFonts w:ascii="Consolas" w:cs="Consolas" w:eastAsia="Consolas" w:hAnsi="Consolas"/>
+          <w:color w:val="1F2937"/>
+          <w:sz w:val="17"/>
+          <w:szCs w:val="17"/>
+        </w:rPr>
+        <w:br/>
+        <w:t xml:space="preserve">    const handler2 = new EnviaConsoleLog2Handler();</w:t>
+      </w:r>
+      <w:r>
+        <w:rPr>
+          <w:rFonts w:ascii="Consolas" w:cs="Consolas" w:eastAsia="Consolas" w:hAnsi="Consolas"/>
+          <w:color w:val="1F2937"/>
+          <w:sz w:val="17"/>
+          <w:szCs w:val="17"/>
+        </w:rPr>
+        <w:br/>
+        <w:t xml:space="preserve">    const spyHandler1 = jest.spyOn(handler1, "handle");</w:t>
+      </w:r>
+      <w:r>
+        <w:rPr>
+          <w:rFonts w:ascii="Consolas" w:cs="Consolas" w:eastAsia="Consolas" w:hAnsi="Consolas"/>
+          <w:color w:val="1F2937"/>
+          <w:sz w:val="17"/>
+          <w:szCs w:val="17"/>
+        </w:rPr>
+        <w:br/>
+        <w:t xml:space="preserve">    const spyHandler2 = jest.spyOn(handler2, "handle");</w:t>
+      </w:r>
+      <w:r>
+        <w:rPr>
+          <w:rFonts w:ascii="Consolas" w:cs="Consolas" w:eastAsia="Consolas" w:hAnsi="Consolas"/>
+          <w:color w:val="1F2937"/>
+          <w:sz w:val="17"/>
+          <w:szCs w:val="17"/>
+        </w:rPr>
+        <w:br/>
+        <w:t xml:space="preserve">    const spyConsoleLog = jest</w:t>
+      </w:r>
+      <w:r>
+        <w:rPr>
+          <w:rFonts w:ascii="Consolas" w:cs="Consolas" w:eastAsia="Consolas" w:hAnsi="Consolas"/>
+          <w:color w:val="1F2937"/>
+          <w:sz w:val="17"/>
+          <w:szCs w:val="17"/>
+        </w:rPr>
+        <w:br/>
+        <w:t xml:space="preserve">      .spyOn(console, "log")</w:t>
+      </w:r>
+      <w:r>
+        <w:rPr>
+          <w:rFonts w:ascii="Consolas" w:cs="Consolas" w:eastAsia="Consolas" w:hAnsi="Consolas"/>
+          <w:color w:val="1F2937"/>
+          <w:sz w:val="17"/>
+          <w:szCs w:val="17"/>
+        </w:rPr>
+        <w:br/>
+        <w:t xml:space="preserve">      .mockImplementation(() =&gt; {});</w:t>
+      </w:r>
+      <w:r>
+        <w:rPr>
+          <w:rFonts w:ascii="Consolas" w:cs="Consolas" w:eastAsia="Consolas" w:hAnsi="Consolas"/>
+          <w:color w:val="1F2937"/>
+          <w:sz w:val="17"/>
+          <w:szCs w:val="17"/>
+        </w:rPr>
+        <w:br/>
+        <w:t xml:space="preserve"> </w:t>
+      </w:r>
+      <w:r>
+        <w:rPr>
+          <w:rFonts w:ascii="Consolas" w:cs="Consolas" w:eastAsia="Consolas" w:hAnsi="Consolas"/>
+          <w:color w:val="1F2937"/>
+          <w:sz w:val="17"/>
+          <w:szCs w:val="17"/>
+        </w:rPr>
+        <w:br/>
+        <w:t xml:space="preserve">    eventDispatcher.register("CustomerCreatedEvent", handler1);</w:t>
+      </w:r>
+      <w:r>
+        <w:rPr>
+          <w:rFonts w:ascii="Consolas" w:cs="Consolas" w:eastAsia="Consolas" w:hAnsi="Consolas"/>
+          <w:color w:val="1F2937"/>
+          <w:sz w:val="17"/>
+          <w:szCs w:val="17"/>
+        </w:rPr>
+        <w:br/>
+        <w:t xml:space="preserve">    eventDispatcher.register("CustomerCreatedEvent", handler2);</w:t>
+      </w:r>
+      <w:r>
+        <w:rPr>
+          <w:rFonts w:ascii="Consolas" w:cs="Consolas" w:eastAsia="Consolas" w:hAnsi="Consolas"/>
+          <w:color w:val="1F2937"/>
+          <w:sz w:val="17"/>
+          <w:szCs w:val="17"/>
+        </w:rPr>
+        <w:br/>
+        <w:t xml:space="preserve"> </w:t>
+      </w:r>
+      <w:r>
+        <w:rPr>
+          <w:rFonts w:ascii="Consolas" w:cs="Consolas" w:eastAsia="Consolas" w:hAnsi="Consolas"/>
+          <w:color w:val="1F2937"/>
+          <w:sz w:val="17"/>
+          <w:szCs w:val="17"/>
+        </w:rPr>
+        <w:br/>
+        <w:t xml:space="preserve">    const customer = new Customer("123", "Customer 1");</w:t>
+      </w:r>
+      <w:r>
+        <w:rPr>
+          <w:rFonts w:ascii="Consolas" w:cs="Consolas" w:eastAsia="Consolas" w:hAnsi="Consolas"/>
+          <w:color w:val="1F2937"/>
+          <w:sz w:val="17"/>
+          <w:szCs w:val="17"/>
+        </w:rPr>
+        <w:br/>
+        <w:t xml:space="preserve">    const customerCreatedEvent = new CustomerCreatedEvent({</w:t>
+      </w:r>
+      <w:r>
+        <w:rPr>
+          <w:rFonts w:ascii="Consolas" w:cs="Consolas" w:eastAsia="Consolas" w:hAnsi="Consolas"/>
+          <w:color w:val="1F2937"/>
+          <w:sz w:val="17"/>
+          <w:szCs w:val="17"/>
+        </w:rPr>
+        <w:br/>
+        <w:t xml:space="preserve">      id: customer.id,</w:t>
+      </w:r>
+      <w:r>
+        <w:rPr>
+          <w:rFonts w:ascii="Consolas" w:cs="Consolas" w:eastAsia="Consolas" w:hAnsi="Consolas"/>
+          <w:color w:val="1F2937"/>
+          <w:sz w:val="17"/>
+          <w:szCs w:val="17"/>
+        </w:rPr>
+        <w:br/>
+        <w:t xml:space="preserve">      name: customer.name,</w:t>
+      </w:r>
+      <w:r>
+        <w:rPr>
+          <w:rFonts w:ascii="Consolas" w:cs="Consolas" w:eastAsia="Consolas" w:hAnsi="Consolas"/>
+          <w:color w:val="1F2937"/>
+          <w:sz w:val="17"/>
+          <w:szCs w:val="17"/>
+        </w:rPr>
+        <w:br/>
+        <w:t xml:space="preserve">    });</w:t>
+      </w:r>
+      <w:r>
+        <w:rPr>
+          <w:rFonts w:ascii="Consolas" w:cs="Consolas" w:eastAsia="Consolas" w:hAnsi="Consolas"/>
+          <w:color w:val="1F2937"/>
+          <w:sz w:val="17"/>
+          <w:szCs w:val="17"/>
+        </w:rPr>
+        <w:br/>
+        <w:t xml:space="preserve"> </w:t>
+      </w:r>
+      <w:r>
+        <w:rPr>
+          <w:rFonts w:ascii="Consolas" w:cs="Consolas" w:eastAsia="Consolas" w:hAnsi="Consolas"/>
+          <w:color w:val="1F2937"/>
+          <w:sz w:val="17"/>
+          <w:szCs w:val="17"/>
+        </w:rPr>
+        <w:br/>
+        <w:t xml:space="preserve">    eventDispatcher.notify(customerCreatedEvent);</w:t>
+      </w:r>
+      <w:r>
+        <w:rPr>
+          <w:rFonts w:ascii="Consolas" w:cs="Consolas" w:eastAsia="Consolas" w:hAnsi="Consolas"/>
+          <w:color w:val="1F2937"/>
+          <w:sz w:val="17"/>
+          <w:szCs w:val="17"/>
+        </w:rPr>
+        <w:br/>
+        <w:t xml:space="preserve"> </w:t>
+      </w:r>
+      <w:r>
+        <w:rPr>
+          <w:rFonts w:ascii="Consolas" w:cs="Consolas" w:eastAsia="Consolas" w:hAnsi="Consolas"/>
+          <w:color w:val="1F2937"/>
+          <w:sz w:val="17"/>
+          <w:szCs w:val="17"/>
+        </w:rPr>
+        <w:br/>
+        <w:t xml:space="preserve">    expect(spyHandler1).toHaveBeenCalledWith(customerCreatedEvent);</w:t>
+      </w:r>
+      <w:r>
+        <w:rPr>
+          <w:rFonts w:ascii="Consolas" w:cs="Consolas" w:eastAsia="Consolas" w:hAnsi="Consolas"/>
+          <w:color w:val="1F2937"/>
+          <w:sz w:val="17"/>
+          <w:szCs w:val="17"/>
+        </w:rPr>
+        <w:br/>
+        <w:t xml:space="preserve">    expect(spyHandler2).toHaveBeenCalledWith(customerCreatedEvent);</w:t>
+      </w:r>
+      <w:r>
+        <w:rPr>
+          <w:rFonts w:ascii="Consolas" w:cs="Consolas" w:eastAsia="Consolas" w:hAnsi="Consolas"/>
+          <w:color w:val="1F2937"/>
+          <w:sz w:val="17"/>
+          <w:szCs w:val="17"/>
+        </w:rPr>
+        <w:br/>
+        <w:t xml:space="preserve">    expect(spyConsoleLog).toHaveBeenCalledWith(</w:t>
+      </w:r>
+      <w:r>
+        <w:rPr>
+          <w:rFonts w:ascii="Consolas" w:cs="Consolas" w:eastAsia="Consolas" w:hAnsi="Consolas"/>
+          <w:color w:val="1F2937"/>
+          <w:sz w:val="17"/>
+          <w:szCs w:val="17"/>
+        </w:rPr>
+        <w:br/>
+        <w:t xml:space="preserve">      "Esse é o primeiro console.log do evento: CustomerCreated"</w:t>
+      </w:r>
+      <w:r>
+        <w:rPr>
+          <w:rFonts w:ascii="Consolas" w:cs="Consolas" w:eastAsia="Consolas" w:hAnsi="Consolas"/>
+          <w:color w:val="1F2937"/>
+          <w:sz w:val="17"/>
+          <w:szCs w:val="17"/>
+        </w:rPr>
+        <w:br/>
+        <w:t xml:space="preserve">    );</w:t>
+      </w:r>
+      <w:r>
+        <w:rPr>
+          <w:rFonts w:ascii="Consolas" w:cs="Consolas" w:eastAsia="Consolas" w:hAnsi="Consolas"/>
+          <w:color w:val="1F2937"/>
+          <w:sz w:val="17"/>
+          <w:szCs w:val="17"/>
+        </w:rPr>
+        <w:br/>
+        <w:t xml:space="preserve">    expect(spyConsoleLog).toHaveBeenCalledWith(</w:t>
+      </w:r>
+      <w:r>
+        <w:rPr>
+          <w:rFonts w:ascii="Consolas" w:cs="Consolas" w:eastAsia="Consolas" w:hAnsi="Consolas"/>
+          <w:color w:val="1F2937"/>
+          <w:sz w:val="17"/>
+          <w:szCs w:val="17"/>
+        </w:rPr>
+        <w:br/>
+        <w:t xml:space="preserve">      "Esse é o segundo console.log do evento: CustomerCreated"</w:t>
+      </w:r>
+      <w:r>
+        <w:rPr>
+          <w:rFonts w:ascii="Consolas" w:cs="Consolas" w:eastAsia="Consolas" w:hAnsi="Consolas"/>
+          <w:color w:val="1F2937"/>
+          <w:sz w:val="17"/>
+          <w:szCs w:val="17"/>
+        </w:rPr>
+        <w:br/>
+        <w:t xml:space="preserve">    );</w:t>
+      </w:r>
+      <w:r>
+        <w:rPr>
+          <w:rFonts w:ascii="Consolas" w:cs="Consolas" w:eastAsia="Consolas" w:hAnsi="Consolas"/>
+          <w:color w:val="1F2937"/>
+          <w:sz w:val="17"/>
+          <w:szCs w:val="17"/>
+        </w:rPr>
+        <w:br/>
+        <w:t xml:space="preserve">    expect(spyConsoleLog).toHaveBeenCalledTimes(2);</w:t>
+      </w:r>
+      <w:r>
+        <w:rPr>
+          <w:rFonts w:ascii="Consolas" w:cs="Consolas" w:eastAsia="Consolas" w:hAnsi="Consolas"/>
+          <w:color w:val="1F2937"/>
+          <w:sz w:val="17"/>
+          <w:szCs w:val="17"/>
+        </w:rPr>
+        <w:br/>
+        <w:t xml:space="preserve">  });</w:t>
+      </w:r>
+    </w:p>
+    <w:p>
+      <w:pPr>
+        <w:pStyle w:val="Heading2"/>
+        <w:spacing w:after="120" w:before="260"/>
+      </w:pPr>
+      <w:r>
+        <w:t xml:space="preserve">7.2 CustomerAddressChangedEvent</w:t>
+      </w:r>
+    </w:p>
+    <w:p>
+      <w:pPr>
+        <w:pBdr>
+          <w:top w:val="single" w:color="CBD5E1" w:sz="6"/>
+          <w:bottom w:val="single" w:color="CBD5E1" w:sz="6"/>
+          <w:left w:val="single" w:color="CBD5E1" w:sz="6"/>
+          <w:right w:val="single" w:color="CBD5E1" w:sz="6"/>
+        </w:pBdr>
+        <w:shd w:fill="F8FAFC" w:color="F8FAFC" w:val="clear"/>
+        <w:spacing w:after="160" w:before="100"/>
+      </w:pPr>
+      <w:r>
+        <w:rPr>
+          <w:rFonts w:ascii="Consolas" w:cs="Consolas" w:eastAsia="Consolas" w:hAnsi="Consolas"/>
+          <w:color w:val="1F2937"/>
+          <w:sz w:val="17"/>
+          <w:szCs w:val="17"/>
+        </w:rPr>
+        <w:t xml:space="preserve">it("should notify handler when a customer address is changed", () =&gt; {</w:t>
+      </w:r>
+      <w:r>
+        <w:rPr>
+          <w:rFonts w:ascii="Consolas" w:cs="Consolas" w:eastAsia="Consolas" w:hAnsi="Consolas"/>
+          <w:color w:val="1F2937"/>
+          <w:sz w:val="17"/>
+          <w:szCs w:val="17"/>
+        </w:rPr>
+        <w:br/>
+        <w:t xml:space="preserve">    const eventDispatcher = new EventDispatcher();</w:t>
+      </w:r>
+      <w:r>
+        <w:rPr>
+          <w:rFonts w:ascii="Consolas" w:cs="Consolas" w:eastAsia="Consolas" w:hAnsi="Consolas"/>
+          <w:color w:val="1F2937"/>
+          <w:sz w:val="17"/>
+          <w:szCs w:val="17"/>
+        </w:rPr>
+        <w:br/>
+        <w:t xml:space="preserve">    const handler = new EnviaConsoleLogHandler();</w:t>
+      </w:r>
+      <w:r>
+        <w:rPr>
+          <w:rFonts w:ascii="Consolas" w:cs="Consolas" w:eastAsia="Consolas" w:hAnsi="Consolas"/>
+          <w:color w:val="1F2937"/>
+          <w:sz w:val="17"/>
+          <w:szCs w:val="17"/>
+        </w:rPr>
+        <w:br/>
+        <w:t xml:space="preserve">    const spyHandler = jest.spyOn(handler, "handle");</w:t>
+      </w:r>
+      <w:r>
+        <w:rPr>
+          <w:rFonts w:ascii="Consolas" w:cs="Consolas" w:eastAsia="Consolas" w:hAnsi="Consolas"/>
+          <w:color w:val="1F2937"/>
+          <w:sz w:val="17"/>
+          <w:szCs w:val="17"/>
+        </w:rPr>
+        <w:br/>
+        <w:t xml:space="preserve">    const spyConsoleLog = jest</w:t>
+      </w:r>
+      <w:r>
+        <w:rPr>
+          <w:rFonts w:ascii="Consolas" w:cs="Consolas" w:eastAsia="Consolas" w:hAnsi="Consolas"/>
+          <w:color w:val="1F2937"/>
+          <w:sz w:val="17"/>
+          <w:szCs w:val="17"/>
+        </w:rPr>
+        <w:br/>
+        <w:t xml:space="preserve">      .spyOn(console, "log")</w:t>
+      </w:r>
+      <w:r>
+        <w:rPr>
+          <w:rFonts w:ascii="Consolas" w:cs="Consolas" w:eastAsia="Consolas" w:hAnsi="Consolas"/>
+          <w:color w:val="1F2937"/>
+          <w:sz w:val="17"/>
+          <w:szCs w:val="17"/>
+        </w:rPr>
+        <w:br/>
+        <w:t xml:space="preserve">      .mockImplementation(() =&gt; {});</w:t>
+      </w:r>
+      <w:r>
+        <w:rPr>
+          <w:rFonts w:ascii="Consolas" w:cs="Consolas" w:eastAsia="Consolas" w:hAnsi="Consolas"/>
+          <w:color w:val="1F2937"/>
+          <w:sz w:val="17"/>
+          <w:szCs w:val="17"/>
+        </w:rPr>
+        <w:br/>
+        <w:t xml:space="preserve"> </w:t>
+      </w:r>
+      <w:r>
+        <w:rPr>
+          <w:rFonts w:ascii="Consolas" w:cs="Consolas" w:eastAsia="Consolas" w:hAnsi="Consolas"/>
+          <w:color w:val="1F2937"/>
+          <w:sz w:val="17"/>
+          <w:szCs w:val="17"/>
+        </w:rPr>
+        <w:br/>
+        <w:t xml:space="preserve">    eventDispatcher.register("CustomerAddressChangedEvent", handler);</w:t>
+      </w:r>
+      <w:r>
+        <w:rPr>
+          <w:rFonts w:ascii="Consolas" w:cs="Consolas" w:eastAsia="Consolas" w:hAnsi="Consolas"/>
+          <w:color w:val="1F2937"/>
+          <w:sz w:val="17"/>
+          <w:szCs w:val="17"/>
+        </w:rPr>
+        <w:br/>
+        <w:t xml:space="preserve"> </w:t>
+      </w:r>
+      <w:r>
+        <w:rPr>
+          <w:rFonts w:ascii="Consolas" w:cs="Consolas" w:eastAsia="Consolas" w:hAnsi="Consolas"/>
+          <w:color w:val="1F2937"/>
+          <w:sz w:val="17"/>
+          <w:szCs w:val="17"/>
+        </w:rPr>
+        <w:br/>
+        <w:t xml:space="preserve">    const customer = new Customer("123", "Customer 1");</w:t>
+      </w:r>
+      <w:r>
+        <w:rPr>
+          <w:rFonts w:ascii="Consolas" w:cs="Consolas" w:eastAsia="Consolas" w:hAnsi="Consolas"/>
+          <w:color w:val="1F2937"/>
+          <w:sz w:val="17"/>
+          <w:szCs w:val="17"/>
+        </w:rPr>
+        <w:br/>
+        <w:t xml:space="preserve">    const address = new Address("Street 1", 10, "12345-000", "Sao Paulo");</w:t>
+      </w:r>
+      <w:r>
+        <w:rPr>
+          <w:rFonts w:ascii="Consolas" w:cs="Consolas" w:eastAsia="Consolas" w:hAnsi="Consolas"/>
+          <w:color w:val="1F2937"/>
+          <w:sz w:val="17"/>
+          <w:szCs w:val="17"/>
+        </w:rPr>
+        <w:br/>
+        <w:t xml:space="preserve">    customer.changeAddress(address);</w:t>
+      </w:r>
+      <w:r>
+        <w:rPr>
+          <w:rFonts w:ascii="Consolas" w:cs="Consolas" w:eastAsia="Consolas" w:hAnsi="Consolas"/>
+          <w:color w:val="1F2937"/>
+          <w:sz w:val="17"/>
+          <w:szCs w:val="17"/>
+        </w:rPr>
+        <w:br/>
+        <w:t xml:space="preserve"> </w:t>
+      </w:r>
+      <w:r>
+        <w:rPr>
+          <w:rFonts w:ascii="Consolas" w:cs="Consolas" w:eastAsia="Consolas" w:hAnsi="Consolas"/>
+          <w:color w:val="1F2937"/>
+          <w:sz w:val="17"/>
+          <w:szCs w:val="17"/>
+        </w:rPr>
+        <w:br/>
+        <w:t xml:space="preserve">    const customerAddressChangedEvent = new CustomerAddressChangedEvent({</w:t>
+      </w:r>
+      <w:r>
+        <w:rPr>
+          <w:rFonts w:ascii="Consolas" w:cs="Consolas" w:eastAsia="Consolas" w:hAnsi="Consolas"/>
+          <w:color w:val="1F2937"/>
+          <w:sz w:val="17"/>
+          <w:szCs w:val="17"/>
+        </w:rPr>
+        <w:br/>
+        <w:t xml:space="preserve">      id: customer.id,</w:t>
+      </w:r>
+      <w:r>
+        <w:rPr>
+          <w:rFonts w:ascii="Consolas" w:cs="Consolas" w:eastAsia="Consolas" w:hAnsi="Consolas"/>
+          <w:color w:val="1F2937"/>
+          <w:sz w:val="17"/>
+          <w:szCs w:val="17"/>
+        </w:rPr>
+        <w:br/>
+        <w:t xml:space="preserve">      name: customer.name,</w:t>
+      </w:r>
+      <w:r>
+        <w:rPr>
+          <w:rFonts w:ascii="Consolas" w:cs="Consolas" w:eastAsia="Consolas" w:hAnsi="Consolas"/>
+          <w:color w:val="1F2937"/>
+          <w:sz w:val="17"/>
+          <w:szCs w:val="17"/>
+        </w:rPr>
+        <w:br/>
+        <w:t xml:space="preserve">      address,</w:t>
+      </w:r>
+      <w:r>
+        <w:rPr>
+          <w:rFonts w:ascii="Consolas" w:cs="Consolas" w:eastAsia="Consolas" w:hAnsi="Consolas"/>
+          <w:color w:val="1F2937"/>
+          <w:sz w:val="17"/>
+          <w:szCs w:val="17"/>
+        </w:rPr>
+        <w:br/>
+        <w:t xml:space="preserve">    });</w:t>
+      </w:r>
+      <w:r>
+        <w:rPr>
+          <w:rFonts w:ascii="Consolas" w:cs="Consolas" w:eastAsia="Consolas" w:hAnsi="Consolas"/>
+          <w:color w:val="1F2937"/>
+          <w:sz w:val="17"/>
+          <w:szCs w:val="17"/>
+        </w:rPr>
+        <w:br/>
+        <w:t xml:space="preserve"> </w:t>
+      </w:r>
+      <w:r>
+        <w:rPr>
+          <w:rFonts w:ascii="Consolas" w:cs="Consolas" w:eastAsia="Consolas" w:hAnsi="Consolas"/>
+          <w:color w:val="1F2937"/>
+          <w:sz w:val="17"/>
+          <w:szCs w:val="17"/>
+        </w:rPr>
+        <w:br/>
+        <w:t xml:space="preserve">    eventDispatcher.notify(customerAddressChangedEvent);</w:t>
+      </w:r>
+      <w:r>
+        <w:rPr>
+          <w:rFonts w:ascii="Consolas" w:cs="Consolas" w:eastAsia="Consolas" w:hAnsi="Consolas"/>
+          <w:color w:val="1F2937"/>
+          <w:sz w:val="17"/>
+          <w:szCs w:val="17"/>
+        </w:rPr>
+        <w:br/>
+        <w:t xml:space="preserve"> </w:t>
+      </w:r>
+      <w:r>
+        <w:rPr>
+          <w:rFonts w:ascii="Consolas" w:cs="Consolas" w:eastAsia="Consolas" w:hAnsi="Consolas"/>
+          <w:color w:val="1F2937"/>
+          <w:sz w:val="17"/>
+          <w:szCs w:val="17"/>
+        </w:rPr>
+        <w:br/>
+        <w:t xml:space="preserve">    expect(customerAddressChangedEvent.eventData).toStrictEqual({</w:t>
+      </w:r>
+      <w:r>
+        <w:rPr>
+          <w:rFonts w:ascii="Consolas" w:cs="Consolas" w:eastAsia="Consolas" w:hAnsi="Consolas"/>
+          <w:color w:val="1F2937"/>
+          <w:sz w:val="17"/>
+          <w:szCs w:val="17"/>
+        </w:rPr>
+        <w:br/>
+        <w:t xml:space="preserve">      id: "123",</w:t>
+      </w:r>
+      <w:r>
+        <w:rPr>
+          <w:rFonts w:ascii="Consolas" w:cs="Consolas" w:eastAsia="Consolas" w:hAnsi="Consolas"/>
+          <w:color w:val="1F2937"/>
+          <w:sz w:val="17"/>
+          <w:szCs w:val="17"/>
+        </w:rPr>
+        <w:br/>
+        <w:t xml:space="preserve">      name: "Customer 1",</w:t>
+      </w:r>
+      <w:r>
+        <w:rPr>
+          <w:rFonts w:ascii="Consolas" w:cs="Consolas" w:eastAsia="Consolas" w:hAnsi="Consolas"/>
+          <w:color w:val="1F2937"/>
+          <w:sz w:val="17"/>
+          <w:szCs w:val="17"/>
+        </w:rPr>
+        <w:br/>
+        <w:t xml:space="preserve">      address,</w:t>
+      </w:r>
+      <w:r>
+        <w:rPr>
+          <w:rFonts w:ascii="Consolas" w:cs="Consolas" w:eastAsia="Consolas" w:hAnsi="Consolas"/>
+          <w:color w:val="1F2937"/>
+          <w:sz w:val="17"/>
+          <w:szCs w:val="17"/>
+        </w:rPr>
+        <w:br/>
+        <w:t xml:space="preserve">    });</w:t>
+      </w:r>
+      <w:r>
+        <w:rPr>
+          <w:rFonts w:ascii="Consolas" w:cs="Consolas" w:eastAsia="Consolas" w:hAnsi="Consolas"/>
+          <w:color w:val="1F2937"/>
+          <w:sz w:val="17"/>
+          <w:szCs w:val="17"/>
+        </w:rPr>
+        <w:br/>
+        <w:t xml:space="preserve">    expect(spyHandler).toHaveBeenCalledWith(customerAddressChangedEvent);</w:t>
+      </w:r>
+      <w:r>
+        <w:rPr>
+          <w:rFonts w:ascii="Consolas" w:cs="Consolas" w:eastAsia="Consolas" w:hAnsi="Consolas"/>
+          <w:color w:val="1F2937"/>
+          <w:sz w:val="17"/>
+          <w:szCs w:val="17"/>
+        </w:rPr>
+        <w:br/>
+        <w:t xml:space="preserve">    expect(spyConsoleLog).toHaveBeenCalledWith(</w:t>
+      </w:r>
+      <w:r>
+        <w:rPr>
+          <w:rFonts w:ascii="Consolas" w:cs="Consolas" w:eastAsia="Consolas" w:hAnsi="Consolas"/>
+          <w:color w:val="1F2937"/>
+          <w:sz w:val="17"/>
+          <w:szCs w:val="17"/>
+        </w:rPr>
+        <w:br/>
+        <w:t xml:space="preserve">      "Endereço do cliente: 123, Customer 1 alterado para: Street 1, 10, 12345-000 Sao Paulo"</w:t>
+      </w:r>
+      <w:r>
+        <w:rPr>
+          <w:rFonts w:ascii="Consolas" w:cs="Consolas" w:eastAsia="Consolas" w:hAnsi="Consolas"/>
+          <w:color w:val="1F2937"/>
+          <w:sz w:val="17"/>
+          <w:szCs w:val="17"/>
+        </w:rPr>
+        <w:br/>
+        <w:t xml:space="preserve">    );</w:t>
+      </w:r>
+      <w:r>
+        <w:rPr>
+          <w:rFonts w:ascii="Consolas" w:cs="Consolas" w:eastAsia="Consolas" w:hAnsi="Consolas"/>
+          <w:color w:val="1F2937"/>
+          <w:sz w:val="17"/>
+          <w:szCs w:val="17"/>
+        </w:rPr>
+        <w:br/>
+        <w:t xml:space="preserve">    expect(spyConsoleLog).toHaveBeenCalledTimes(1);</w:t>
+      </w:r>
+      <w:r>
+        <w:rPr>
+          <w:rFonts w:ascii="Consolas" w:cs="Consolas" w:eastAsia="Consolas" w:hAnsi="Consolas"/>
+          <w:color w:val="1F2937"/>
+          <w:sz w:val="17"/>
+          <w:szCs w:val="17"/>
+        </w:rPr>
+        <w:br/>
+        <w:t xml:space="preserve">  });</w:t>
+      </w:r>
+    </w:p>
+    <w:p>
+      <w:pPr>
+        <w:pStyle w:val="Heading1"/>
+        <w:spacing w:after="120" w:before="260"/>
+      </w:pPr>
+      <w:r>
+        <w:t xml:space="preserve">8. Resultado dos Testes</w:t>
+      </w:r>
+    </w:p>
+    <w:p>
+      <w:pPr>
+        <w:spacing w:after="80" w:before="80"/>
+      </w:pPr>
+      <w:r>
+        <w:rPr>
+          <w:rFonts w:ascii="Calibri" w:cs="Calibri" w:eastAsia="Calibri" w:hAnsi="Calibri"/>
+          <w:b/>
+          <w:bCs/>
+          <w:sz w:val="22"/>
+          <w:szCs w:val="22"/>
+        </w:rPr>
+        <w:t xml:space="preserve">Comando executado: </w:t>
+      </w:r>
+      <w:r>
+        <w:rPr>
+          <w:rFonts w:ascii="Consolas" w:cs="Consolas" w:eastAsia="Consolas" w:hAnsi="Consolas"/>
+          <w:color w:val="0369A1"/>
+          <w:sz w:val="22"/>
+          <w:szCs w:val="22"/>
+        </w:rPr>
+        <w:t xml:space="preserve">npm.cmd test</w:t>
+      </w:r>
+    </w:p>
+    <w:p>
+      <w:pPr>
+        <w:spacing w:after="80" w:before="80"/>
+      </w:pPr>
+      <w:r>
+        <w:rPr>
+          <w:rFonts w:ascii="Calibri" w:cs="Calibri" w:eastAsia="Calibri" w:hAnsi="Calibri"/>
+          <w:sz w:val="22"/>
+          <w:szCs w:val="22"/>
+        </w:rPr>
+        <w:t xml:space="preserve">Evidencia em arquivo: Analise/npm-test-evento-customer-resultado.txt</w:t>
+      </w:r>
+    </w:p>
+    <w:p>
+      <w:pPr>
+        <w:pBdr>
+          <w:top w:val="single" w:color="CBD5E1" w:sz="6"/>
+          <w:bottom w:val="single" w:color="CBD5E1" w:sz="6"/>
+          <w:left w:val="single" w:color="CBD5E1" w:sz="6"/>
+          <w:right w:val="single" w:color="CBD5E1" w:sz="6"/>
+        </w:pBdr>
+        <w:shd w:fill="F8FAFC" w:color="F8FAFC" w:val="clear"/>
+        <w:spacing w:after="160" w:before="100"/>
+      </w:pPr>
+      <w:r>
+        <w:rPr>
+          <w:rFonts w:ascii="Consolas" w:cs="Consolas" w:eastAsia="Consolas" w:hAnsi="Consolas"/>
+          <w:color w:val="1F2937"/>
+          <w:sz w:val="17"/>
+          <w:szCs w:val="17"/>
+        </w:rPr>
+        <w:t xml:space="preserve">&gt; test</w:t>
+      </w:r>
+      <w:r>
+        <w:rPr>
+          <w:rFonts w:ascii="Consolas" w:cs="Consolas" w:eastAsia="Consolas" w:hAnsi="Consolas"/>
+          <w:color w:val="1F2937"/>
+          <w:sz w:val="17"/>
+          <w:szCs w:val="17"/>
+        </w:rPr>
+        <w:br/>
+        <w:t xml:space="preserve">&gt; npm run tsc -- --noEmit &amp;&amp; jest</w:t>
+      </w:r>
+      <w:r>
+        <w:rPr>
+          <w:rFonts w:ascii="Consolas" w:cs="Consolas" w:eastAsia="Consolas" w:hAnsi="Consolas"/>
+          <w:color w:val="1F2937"/>
+          <w:sz w:val="17"/>
+          <w:szCs w:val="17"/>
+        </w:rPr>
+        <w:br/>
+        <w:t xml:space="preserve"> </w:t>
+      </w:r>
+      <w:r>
+        <w:rPr>
+          <w:rFonts w:ascii="Consolas" w:cs="Consolas" w:eastAsia="Consolas" w:hAnsi="Consolas"/>
+          <w:color w:val="1F2937"/>
+          <w:sz w:val="17"/>
+          <w:szCs w:val="17"/>
+        </w:rPr>
+        <w:br/>
+        <w:t xml:space="preserve"> </w:t>
+      </w:r>
+      <w:r>
+        <w:rPr>
+          <w:rFonts w:ascii="Consolas" w:cs="Consolas" w:eastAsia="Consolas" w:hAnsi="Consolas"/>
+          <w:color w:val="1F2937"/>
+          <w:sz w:val="17"/>
+          <w:szCs w:val="17"/>
+        </w:rPr>
+        <w:br/>
+        <w:t xml:space="preserve">&gt; tsc</w:t>
+      </w:r>
+      <w:r>
+        <w:rPr>
+          <w:rFonts w:ascii="Consolas" w:cs="Consolas" w:eastAsia="Consolas" w:hAnsi="Consolas"/>
+          <w:color w:val="1F2937"/>
+          <w:sz w:val="17"/>
+          <w:szCs w:val="17"/>
+        </w:rPr>
+        <w:br/>
+        <w:t xml:space="preserve">&gt; tsc --noEmit</w:t>
+      </w:r>
+      <w:r>
+        <w:rPr>
+          <w:rFonts w:ascii="Consolas" w:cs="Consolas" w:eastAsia="Consolas" w:hAnsi="Consolas"/>
+          <w:color w:val="1F2937"/>
+          <w:sz w:val="17"/>
+          <w:szCs w:val="17"/>
+        </w:rPr>
+        <w:br/>
+        <w:t xml:space="preserve"> </w:t>
+      </w:r>
+      <w:r>
+        <w:rPr>
+          <w:rFonts w:ascii="Consolas" w:cs="Consolas" w:eastAsia="Consolas" w:hAnsi="Consolas"/>
+          <w:color w:val="1F2937"/>
+          <w:sz w:val="17"/>
+          <w:szCs w:val="17"/>
+        </w:rPr>
+        <w:br/>
+        <w:t xml:space="preserve">PASS src/domain/checkout/service/order.service.spec.ts</w:t>
+      </w:r>
+      <w:r>
+        <w:rPr>
+          <w:rFonts w:ascii="Consolas" w:cs="Consolas" w:eastAsia="Consolas" w:hAnsi="Consolas"/>
+          <w:color w:val="1F2937"/>
+          <w:sz w:val="17"/>
+          <w:szCs w:val="17"/>
+        </w:rPr>
+        <w:br/>
+        <w:t xml:space="preserve">PASS src/domain/customer/factory/customer.factory.spec.ts</w:t>
+      </w:r>
+      <w:r>
+        <w:rPr>
+          <w:rFonts w:ascii="Consolas" w:cs="Consolas" w:eastAsia="Consolas" w:hAnsi="Consolas"/>
+          <w:color w:val="1F2937"/>
+          <w:sz w:val="17"/>
+          <w:szCs w:val="17"/>
+        </w:rPr>
+        <w:br/>
+        <w:t xml:space="preserve">PASS src/domain/product/service/product.service.spec.ts</w:t>
+      </w:r>
+      <w:r>
+        <w:rPr>
+          <w:rFonts w:ascii="Consolas" w:cs="Consolas" w:eastAsia="Consolas" w:hAnsi="Consolas"/>
+          <w:color w:val="1F2937"/>
+          <w:sz w:val="17"/>
+          <w:szCs w:val="17"/>
+        </w:rPr>
+        <w:br/>
+        <w:t xml:space="preserve">PASS src/domain/checkout/factory/order.factory.spec.ts</w:t>
+      </w:r>
+      <w:r>
+        <w:rPr>
+          <w:rFonts w:ascii="Consolas" w:cs="Consolas" w:eastAsia="Consolas" w:hAnsi="Consolas"/>
+          <w:color w:val="1F2937"/>
+          <w:sz w:val="17"/>
+          <w:szCs w:val="17"/>
+        </w:rPr>
+        <w:br/>
+        <w:t xml:space="preserve">PASS src/domain/@shared/event/event-dispatcher.spec.ts</w:t>
+      </w:r>
+      <w:r>
+        <w:rPr>
+          <w:rFonts w:ascii="Consolas" w:cs="Consolas" w:eastAsia="Consolas" w:hAnsi="Consolas"/>
+          <w:color w:val="1F2937"/>
+          <w:sz w:val="17"/>
+          <w:szCs w:val="17"/>
+        </w:rPr>
+        <w:br/>
+        <w:t xml:space="preserve">  ● Console</w:t>
+      </w:r>
+      <w:r>
+        <w:rPr>
+          <w:rFonts w:ascii="Consolas" w:cs="Consolas" w:eastAsia="Consolas" w:hAnsi="Consolas"/>
+          <w:color w:val="1F2937"/>
+          <w:sz w:val="17"/>
+          <w:szCs w:val="17"/>
+        </w:rPr>
+        <w:br/>
+        <w:t xml:space="preserve"> </w:t>
+      </w:r>
+      <w:r>
+        <w:rPr>
+          <w:rFonts w:ascii="Consolas" w:cs="Consolas" w:eastAsia="Consolas" w:hAnsi="Consolas"/>
+          <w:color w:val="1F2937"/>
+          <w:sz w:val="17"/>
+          <w:szCs w:val="17"/>
+        </w:rPr>
+        <w:br/>
+        <w:t xml:space="preserve">    console.log</w:t>
+      </w:r>
+      <w:r>
+        <w:rPr>
+          <w:rFonts w:ascii="Consolas" w:cs="Consolas" w:eastAsia="Consolas" w:hAnsi="Consolas"/>
+          <w:color w:val="1F2937"/>
+          <w:sz w:val="17"/>
+          <w:szCs w:val="17"/>
+        </w:rPr>
+        <w:br/>
+        <w:t xml:space="preserve">      Sending email to .....</w:t>
+      </w:r>
+      <w:r>
+        <w:rPr>
+          <w:rFonts w:ascii="Consolas" w:cs="Consolas" w:eastAsia="Consolas" w:hAnsi="Consolas"/>
+          <w:color w:val="1F2937"/>
+          <w:sz w:val="17"/>
+          <w:szCs w:val="17"/>
+        </w:rPr>
+        <w:br/>
+        <w:t xml:space="preserve"> </w:t>
+      </w:r>
+      <w:r>
+        <w:rPr>
+          <w:rFonts w:ascii="Consolas" w:cs="Consolas" w:eastAsia="Consolas" w:hAnsi="Consolas"/>
+          <w:color w:val="1F2937"/>
+          <w:sz w:val="17"/>
+          <w:szCs w:val="17"/>
+        </w:rPr>
+        <w:br/>
+        <w:t xml:space="preserve">      at SendEmailWhenProductIsCreatedHandler.handle (src/domain/product/event/handler/send-email-when-product-is-created.handler.ts:8:13)</w:t>
+      </w:r>
+      <w:r>
+        <w:rPr>
+          <w:rFonts w:ascii="Consolas" w:cs="Consolas" w:eastAsia="Consolas" w:hAnsi="Consolas"/>
+          <w:color w:val="1F2937"/>
+          <w:sz w:val="17"/>
+          <w:szCs w:val="17"/>
+        </w:rPr>
+        <w:br/>
+        <w:t xml:space="preserve">          at Array.forEach (&lt;anonymous&gt;)</w:t>
+      </w:r>
+      <w:r>
+        <w:rPr>
+          <w:rFonts w:ascii="Consolas" w:cs="Consolas" w:eastAsia="Consolas" w:hAnsi="Consolas"/>
+          <w:color w:val="1F2937"/>
+          <w:sz w:val="17"/>
+          <w:szCs w:val="17"/>
+        </w:rPr>
+        <w:br/>
+        <w:t xml:space="preserve"> </w:t>
+      </w:r>
+      <w:r>
+        <w:rPr>
+          <w:rFonts w:ascii="Consolas" w:cs="Consolas" w:eastAsia="Consolas" w:hAnsi="Consolas"/>
+          <w:color w:val="1F2937"/>
+          <w:sz w:val="17"/>
+          <w:szCs w:val="17"/>
+        </w:rPr>
+        <w:br/>
+        <w:t xml:space="preserve">PASS src/domain/product/factory/product.factory.spec.ts</w:t>
+      </w:r>
+      <w:r>
+        <w:rPr>
+          <w:rFonts w:ascii="Consolas" w:cs="Consolas" w:eastAsia="Consolas" w:hAnsi="Consolas"/>
+          <w:color w:val="1F2937"/>
+          <w:sz w:val="17"/>
+          <w:szCs w:val="17"/>
+        </w:rPr>
+        <w:br/>
+        <w:t xml:space="preserve">PASS src/domain/checkout/entity/order.spec.ts</w:t>
+      </w:r>
+      <w:r>
+        <w:rPr>
+          <w:rFonts w:ascii="Consolas" w:cs="Consolas" w:eastAsia="Consolas" w:hAnsi="Consolas"/>
+          <w:color w:val="1F2937"/>
+          <w:sz w:val="17"/>
+          <w:szCs w:val="17"/>
+        </w:rPr>
+        <w:br/>
+        <w:t xml:space="preserve">PASS src/domain/customer/event/customer-event-dispatcher.spec.ts</w:t>
+      </w:r>
+      <w:r>
+        <w:rPr>
+          <w:rFonts w:ascii="Consolas" w:cs="Consolas" w:eastAsia="Consolas" w:hAnsi="Consolas"/>
+          <w:color w:val="1F2937"/>
+          <w:sz w:val="17"/>
+          <w:szCs w:val="17"/>
+        </w:rPr>
+        <w:br/>
+        <w:t xml:space="preserve">PASS src/domain/product/entity/product.spec.ts</w:t>
+      </w:r>
+      <w:r>
+        <w:rPr>
+          <w:rFonts w:ascii="Consolas" w:cs="Consolas" w:eastAsia="Consolas" w:hAnsi="Consolas"/>
+          <w:color w:val="1F2937"/>
+          <w:sz w:val="17"/>
+          <w:szCs w:val="17"/>
+        </w:rPr>
+        <w:br/>
+        <w:t xml:space="preserve">PASS src/domain/customer/entity/customer.spec.ts</w:t>
+      </w:r>
+      <w:r>
+        <w:rPr>
+          <w:rFonts w:ascii="Consolas" w:cs="Consolas" w:eastAsia="Consolas" w:hAnsi="Consolas"/>
+          <w:color w:val="1F2937"/>
+          <w:sz w:val="17"/>
+          <w:szCs w:val="17"/>
+        </w:rPr>
+        <w:br/>
+        <w:t xml:space="preserve">PASS src/infrastructure/product/repository/sequelize/product.repository.spec.ts</w:t>
+      </w:r>
+      <w:r>
+        <w:rPr>
+          <w:rFonts w:ascii="Consolas" w:cs="Consolas" w:eastAsia="Consolas" w:hAnsi="Consolas"/>
+          <w:color w:val="1F2937"/>
+          <w:sz w:val="17"/>
+          <w:szCs w:val="17"/>
+        </w:rPr>
+        <w:br/>
+        <w:t xml:space="preserve">PASS src/infrastructure/customer/repository/sequelize/customer.repository.spec.ts</w:t>
+      </w:r>
+      <w:r>
+        <w:rPr>
+          <w:rFonts w:ascii="Consolas" w:cs="Consolas" w:eastAsia="Consolas" w:hAnsi="Consolas"/>
+          <w:color w:val="1F2937"/>
+          <w:sz w:val="17"/>
+          <w:szCs w:val="17"/>
+        </w:rPr>
+        <w:br/>
+        <w:t xml:space="preserve">PASS src/infrastructure/order/repository/sequilize/order.repository.spec.ts</w:t>
+      </w:r>
+      <w:r>
+        <w:rPr>
+          <w:rFonts w:ascii="Consolas" w:cs="Consolas" w:eastAsia="Consolas" w:hAnsi="Consolas"/>
+          <w:color w:val="1F2937"/>
+          <w:sz w:val="17"/>
+          <w:szCs w:val="17"/>
+        </w:rPr>
+        <w:br/>
+        <w:t xml:space="preserve"> </w:t>
+      </w:r>
+      <w:r>
+        <w:rPr>
+          <w:rFonts w:ascii="Consolas" w:cs="Consolas" w:eastAsia="Consolas" w:hAnsi="Consolas"/>
+          <w:color w:val="1F2937"/>
+          <w:sz w:val="17"/>
+          <w:szCs w:val="17"/>
+        </w:rPr>
+        <w:br/>
+        <w:t xml:space="preserve">Test Suites: 13 passed, 13 total</w:t>
+      </w:r>
+      <w:r>
+        <w:rPr>
+          <w:rFonts w:ascii="Consolas" w:cs="Consolas" w:eastAsia="Consolas" w:hAnsi="Consolas"/>
+          <w:color w:val="1F2937"/>
+          <w:sz w:val="17"/>
+          <w:szCs w:val="17"/>
+        </w:rPr>
+        <w:br/>
+        <w:t xml:space="preserve">Tests:       46 passed, 46 total</w:t>
+      </w:r>
+      <w:r>
+        <w:rPr>
+          <w:rFonts w:ascii="Consolas" w:cs="Consolas" w:eastAsia="Consolas" w:hAnsi="Consolas"/>
+          <w:color w:val="1F2937"/>
+          <w:sz w:val="17"/>
+          <w:szCs w:val="17"/>
+        </w:rPr>
+        <w:br/>
+        <w:t xml:space="preserve">Snapshots:   0 total</w:t>
+      </w:r>
+      <w:r>
+        <w:rPr>
+          <w:rFonts w:ascii="Consolas" w:cs="Consolas" w:eastAsia="Consolas" w:hAnsi="Consolas"/>
+          <w:color w:val="1F2937"/>
+          <w:sz w:val="17"/>
+          <w:szCs w:val="17"/>
+        </w:rPr>
+        <w:br/>
+        <w:t xml:space="preserve">Time:        2.478 s</w:t>
+      </w:r>
+      <w:r>
+        <w:rPr>
+          <w:rFonts w:ascii="Consolas" w:cs="Consolas" w:eastAsia="Consolas" w:hAnsi="Consolas"/>
+          <w:color w:val="1F2937"/>
+          <w:sz w:val="17"/>
+          <w:szCs w:val="17"/>
+        </w:rPr>
+        <w:br/>
+        <w:t xml:space="preserve">Ran all test suites.</w:t>
+      </w:r>
+    </w:p>
+    <w:p>
+      <w:pPr>
+        <w:pStyle w:val="Heading1"/>
+        <w:spacing w:after="120" w:before="260"/>
+      </w:pPr>
+      <w:r>
+        <w:t xml:space="preserve">9. Instrucoes para Rodar</w:t>
       </w:r>
     </w:p>
     <w:p>
@@ -3639,7 +4216,7 @@
         <w:spacing w:after="120" w:before="260"/>
       </w:pPr>
       <w:r>
-        <w:t xml:space="preserve">9. Conclusao</w:t>
+        <w:t xml:space="preserve">10. Conclusao</w:t>
       </w:r>
     </w:p>
     <w:p>

</xml_diff>